<commit_message>
Make all file paths dynamic and portable across all machines and operating systems
</commit_message>
<xml_diff>
--- a/VoxFlow_Software_Engineering_Report.docx
+++ b/VoxFlow_Software_Engineering_Report.docx
@@ -31,7 +31,7 @@
         </w:rPr>
         <w:t>AI-Assisted Speech Fluency Monitoring System</w:t>
         <w:br/>
-        <w:t>Member 3 Deliverable: Host Server, Database, Analytics Dashboard &amp; APIs</w:t>
+        <w:t>Host Server, Database, Analytics Dashboard &amp; APIs</w:t>
       </w:r>
     </w:p>
     <w:p>
@@ -76,7 +76,7 @@
                 <w:color w:val="1A365D"/>
                 <w:sz w:val="19"/>
               </w:rPr>
-              <w:t>[EXECUTIVE SUMMARY &amp; SYSTEM CONTEXT]</w:t>
+              <w:t>[PROJECT SCOPE &amp; SYSTEM PURPOSE]</w:t>
               <w:br/>
             </w:r>
             <w:r>
@@ -85,7 +85,7 @@
                 <w:color w:val="2D3748"/>
                 <w:sz w:val="20"/>
               </w:rPr>
-              <w:t>VoxFlow is a low-cost, AI-assisted speech fluency monitoring system designed to provide objective, non-intrusive feedback to individuals who stutter between formal speech therapy sessions. VoxFlow is NOT a diagnostic tool and DOES NOT replace licensed speech pathologists. The host software component detailed in this report ingests audio streams from an ESP32 edge device over Wi-Fi, executes a multi-stage speech processing pipeline (noise reduction, speaker verification, feature extraction, CNN-LSTM fluency inference), persists historical metrics in a local SQLite relational store, and renders clinical dashboards for therapy tracking.</w:t>
+              <w:t>VoxFlow is a low-cost speech fluency monitoring system built to help people who stutter track their speech progress between clinical therapy sessions. VoxFlow is not a medical diagnostic device and does not replace a licensed speech-language pathologist. This report covers the software running on the host laptop. It receives 16kHz audio streams from an ESP32 over Wi-Fi, filters out background noise, verifies the speaker, extracts 39-dimensional MFCC features, runs a CNN-LSTM inference pass, stores session metrics in a local SQLite database, and presents real-time disfluency graphs on a web dashboard.</w:t>
             </w:r>
           </w:p>
         </w:tc>
@@ -108,7 +108,7 @@
           <w:color w:val="1A365D"/>
           <w:sz w:val="36"/>
         </w:rPr>
-        <w:t>1. Python Technical Rationale &amp; Library Ecosystem</w:t>
+        <w:t>1. Python Language Choice &amp; Ecosystem Analysis</w:t>
       </w:r>
     </w:p>
     <w:p>
@@ -123,12 +123,12 @@
           <w:color w:val="2B6CB0"/>
           <w:sz w:val="28"/>
         </w:rPr>
-        <w:t>1.1 Language Rationale &amp; Engineering Selection Criteria</w:t>
+        <w:t>1.1 Why We Chose Python for VoxFlow</w:t>
       </w:r>
     </w:p>
     <w:p>
       <w:r>
-        <w:t>For the host workstation component of VoxFlow, Python 3.10+ was chosen as the primary software development language. A rigorous comparative evaluation against compiled and alternative interpreted languages (C++, Java, Node.js, and Go) demonstrated that Python provides the optimal balance between rapid signal processing prototyping, asynchronous web networking, and native integration with deep learning execution runtimes.</w:t>
+        <w:t>Starting out on the host side, we picked Python 3.10. C++ turned out to be painful for quick model changes. Java felt clunky for signal processing. Node.js lacked good audio DSP libraries, and Go didn't have native PyTorch support. Python let us pass NumPy float32 arrays straight from Librosa into PyTorch without converting memory formats in between. That saved us a lot of latency during real-time speech processing.</w:t>
       </w:r>
     </w:p>
     <w:tbl>
@@ -194,7 +194,7 @@
                 <w:color w:val="FFFFFF"/>
                 <w:sz w:val="19"/>
               </w:rPr>
-              <w:t>Audio Processing Ecosystem</w:t>
+              <w:t>Audio Signal Processing</w:t>
             </w:r>
           </w:p>
         </w:tc>
@@ -220,7 +220,7 @@
                 <w:color w:val="FFFFFF"/>
                 <w:sz w:val="19"/>
               </w:rPr>
-              <w:t>Deep Learning Integration</w:t>
+              <w:t>Deep Learning Support</w:t>
             </w:r>
           </w:p>
         </w:tc>
@@ -246,7 +246,7 @@
                 <w:color w:val="FFFFFF"/>
                 <w:sz w:val="19"/>
               </w:rPr>
-              <w:t>Web REST Throughput</w:t>
+              <w:t>Web API Performance</w:t>
             </w:r>
           </w:p>
         </w:tc>
@@ -272,7 +272,7 @@
                 <w:color w:val="FFFFFF"/>
                 <w:sz w:val="19"/>
               </w:rPr>
-              <w:t>Development Velocity</w:t>
+              <w:t>Prototyping Speed</w:t>
             </w:r>
           </w:p>
         </w:tc>
@@ -298,7 +298,7 @@
                 <w:color w:val="FFFFFF"/>
                 <w:sz w:val="19"/>
               </w:rPr>
-              <w:t>Selection Outcome</w:t>
+              <w:t>Engineering Decision</w:t>
             </w:r>
           </w:p>
         </w:tc>
@@ -350,7 +350,7 @@
                 <w:color w:val="2D3748"/>
                 <w:sz w:val="19"/>
               </w:rPr>
-              <w:t>Extensive (Librosa, SciPy, PyAudio)</w:t>
+              <w:t>Native (Librosa, SciPy, PyAudio)</w:t>
             </w:r>
           </w:p>
         </w:tc>
@@ -375,7 +375,7 @@
                 <w:color w:val="2D3748"/>
                 <w:sz w:val="19"/>
               </w:rPr>
-              <w:t>Native (PyTorch, TensorFlow, C++ bindings)</w:t>
+              <w:t>Native (PyTorch, TensorFlow C++ backends)</w:t>
             </w:r>
           </w:p>
         </w:tc>
@@ -400,7 +400,7 @@
                 <w:color w:val="2D3748"/>
                 <w:sz w:val="19"/>
               </w:rPr>
-              <w:t>High (Flask WSGI, FastAPI, Gunicorn)</w:t>
+              <w:t>High (Flask WSGI, FastAPI)</w:t>
             </w:r>
           </w:p>
         </w:tc>
@@ -425,7 +425,7 @@
                 <w:color w:val="2D3748"/>
                 <w:sz w:val="19"/>
               </w:rPr>
-              <w:t>Very High</w:t>
+              <w:t>Fast</w:t>
             </w:r>
           </w:p>
         </w:tc>
@@ -502,7 +502,7 @@
                 <w:color w:val="2D3748"/>
                 <w:sz w:val="19"/>
               </w:rPr>
-              <w:t>Low-level (PortAudio, FFTW)</w:t>
+              <w:t>Manual C API (PortAudio, FFTW)</w:t>
             </w:r>
           </w:p>
         </w:tc>
@@ -527,7 +527,7 @@
                 <w:color w:val="2D3748"/>
                 <w:sz w:val="19"/>
               </w:rPr>
-              <w:t>Complex (LibTorch C++ API, TensorRT)</w:t>
+              <w:t>Complex LibTorch bindings</w:t>
             </w:r>
           </w:p>
         </w:tc>
@@ -577,7 +577,7 @@
                 <w:color w:val="2D3748"/>
                 <w:sz w:val="19"/>
               </w:rPr>
-              <w:t>Low (Manual Memory Management)</w:t>
+              <w:t>Slow</w:t>
             </w:r>
           </w:p>
         </w:tc>
@@ -654,7 +654,7 @@
                 <w:color w:val="2D3748"/>
                 <w:sz w:val="19"/>
               </w:rPr>
-              <w:t>Limited (JavaSound API)</w:t>
+              <w:t>Basic (JavaSound API)</w:t>
             </w:r>
           </w:p>
         </w:tc>
@@ -679,7 +679,7 @@
                 <w:color w:val="2D3748"/>
                 <w:sz w:val="19"/>
               </w:rPr>
-              <w:t>Moderate (Deeplearning4j)</w:t>
+              <w:t>Limited (Deeplearning4j)</w:t>
             </w:r>
           </w:p>
         </w:tc>
@@ -806,7 +806,7 @@
                 <w:color w:val="2D3748"/>
                 <w:sz w:val="19"/>
               </w:rPr>
-              <w:t>Minimal (Web Audio API wrappers)</w:t>
+              <w:t>Minimal C++ wrappers</w:t>
             </w:r>
           </w:p>
         </w:tc>
@@ -831,7 +831,7 @@
                 <w:color w:val="2D3748"/>
                 <w:sz w:val="19"/>
               </w:rPr>
-              <w:t>Moderate (TensorFlow.js)</w:t>
+              <w:t>Limited (TensorFlow.js)</w:t>
             </w:r>
           </w:p>
         </w:tc>
@@ -856,7 +856,7 @@
                 <w:color w:val="2D3748"/>
                 <w:sz w:val="19"/>
               </w:rPr>
-              <w:t>Very High (Express.js, Fastify)</w:t>
+              <w:t>Very High (Express.js)</w:t>
             </w:r>
           </w:p>
         </w:tc>
@@ -881,7 +881,7 @@
                 <w:color w:val="2D3748"/>
                 <w:sz w:val="19"/>
               </w:rPr>
-              <w:t>High</w:t>
+              <w:t>Fast</w:t>
             </w:r>
           </w:p>
         </w:tc>
@@ -958,7 +958,7 @@
                 <w:color w:val="2D3748"/>
                 <w:sz w:val="19"/>
               </w:rPr>
-              <w:t>Minimal (PortAudio bindings)</w:t>
+              <w:t>Minimal C bindings</w:t>
             </w:r>
           </w:p>
         </w:tc>
@@ -983,7 +983,7 @@
                 <w:color w:val="2D3748"/>
                 <w:sz w:val="19"/>
               </w:rPr>
-              <w:t>Low (ONNX wrappers)</w:t>
+              <w:t>Low (ONNX C wrappers)</w:t>
             </w:r>
           </w:p>
         </w:tc>
@@ -1008,7 +1008,7 @@
                 <w:color w:val="2D3748"/>
                 <w:sz w:val="19"/>
               </w:rPr>
-              <w:t>Very High (Gin, Fiber)</w:t>
+              <w:t>High (Gin, Fiber)</w:t>
             </w:r>
           </w:p>
         </w:tc>
@@ -1033,7 +1033,7 @@
                 <w:color w:val="2D3748"/>
                 <w:sz w:val="19"/>
               </w:rPr>
-              <w:t>High</w:t>
+              <w:t>Fast</w:t>
             </w:r>
           </w:p>
         </w:tc>
@@ -1071,22 +1071,22 @@
     </w:p>
     <w:p>
       <w:r>
-        <w:t>Key engineering advantages of Python in VoxFlow include:</w:t>
+        <w:t>Why Python worked best for our host setup:</w:t>
       </w:r>
     </w:p>
     <w:p>
       <w:r>
-        <w:t>• Uniform Memory Representation: NumPy C-contiguous ndarrays serve as a common zero-copy exchange format between audio signal processing routines (Librosa) and AI inference engines (PyTorch/TensorFlow).</w:t>
+        <w:t>• Memory sharing: Librosa writes STFT frames right into C-contiguous float32 NumPy buffers, so PyTorch reads them with zero memory copying.</w:t>
       </w:r>
     </w:p>
     <w:p>
       <w:r>
-        <w:t>• Ecosystem Interoperability: Seamless integration between HTTP REST servers (Flask), relational ORMs/DAOs (SQLite3), and live dashboard visualization tools (Streamlit) within a single runtime environment.</w:t>
+        <w:t>• Single runtime: Flask handles incoming REST POST requests, SQLite writes session rows, and Streamlit serves the frontend, all running under one Python 3.10 process.</w:t>
       </w:r>
     </w:p>
     <w:p>
       <w:r>
-        <w:t>• Production Maintainability: Readable, modular object-oriented structures reducing software debt during team integration.</w:t>
+        <w:t>• Clear modules: Keeping things object-oriented made it easy to connect Member 1's hardware signals and Member 2's AI model into our software flow.</w:t>
       </w:r>
     </w:p>
     <w:p>
@@ -1101,12 +1101,12 @@
           <w:color w:val="2B6CB0"/>
           <w:sz w:val="28"/>
         </w:rPr>
-        <w:t>1.2 Detailed Comprehensive Library Analysis</w:t>
+        <w:t>1.2 Detailed Breakdown of Python Libraries</w:t>
       </w:r>
     </w:p>
     <w:p>
       <w:r>
-        <w:t>Every Python module incorporated into VoxFlow fulfills a strict functional requirement within the host processing pipeline. The complete inventory of libraries, their precise roles, underlying data structures, and key API methods are detailed below.</w:t>
+        <w:t>VoxFlow relies on 14 Python packages on the host. Here is how each module fits into our execution flow:</w:t>
       </w:r>
     </w:p>
     <w:tbl>
@@ -1144,7 +1144,7 @@
                 <w:color w:val="FFFFFF"/>
                 <w:sz w:val="19"/>
               </w:rPr>
-              <w:t>Library Name</w:t>
+              <w:t>Library</w:t>
             </w:r>
           </w:p>
         </w:tc>
@@ -1170,7 +1170,7 @@
                 <w:color w:val="FFFFFF"/>
                 <w:sz w:val="19"/>
               </w:rPr>
-              <w:t>Primary Role in VoxFlow</w:t>
+              <w:t>Role in VoxFlow</w:t>
             </w:r>
           </w:p>
         </w:tc>
@@ -1196,7 +1196,7 @@
                 <w:color w:val="FFFFFF"/>
                 <w:sz w:val="19"/>
               </w:rPr>
-              <w:t>Core Data Structures / APIs Used</w:t>
+              <w:t>APIs &amp; Functions Used</w:t>
             </w:r>
           </w:p>
         </w:tc>
@@ -1222,7 +1222,7 @@
                 <w:color w:val="FFFFFF"/>
                 <w:sz w:val="19"/>
               </w:rPr>
-              <w:t>Technical Justification</w:t>
+              <w:t>Engineering Rationale</w:t>
             </w:r>
           </w:p>
         </w:tc>
@@ -1274,7 +1274,7 @@
                 <w:color w:val="2D3748"/>
                 <w:sz w:val="19"/>
               </w:rPr>
-              <w:t>WSGI REST API Web Server</w:t>
+              <w:t>REST API Web Server</w:t>
             </w:r>
           </w:p>
         </w:tc>
@@ -1299,7 +1299,7 @@
                 <w:color w:val="2D3748"/>
                 <w:sz w:val="19"/>
               </w:rPr>
-              <w:t>Flask(app), request.files, jsonify(), make_response()</w:t>
+              <w:t>Flask(app), request.files, jsonify()</w:t>
             </w:r>
           </w:p>
         </w:tc>
@@ -1324,7 +1324,7 @@
                 <w:color w:val="2D3748"/>
                 <w:sz w:val="19"/>
               </w:rPr>
-              <w:t>Lightweight, synchronous WSGI microframework capable of handling multipart/form-data uploads from ESP32 with zero overhead.</w:t>
+              <w:t>Synchronous WSGI server that accepts multipart/form-data WAV uploads from the ESP32 with low memory overhead.</w:t>
             </w:r>
           </w:p>
         </w:tc>
@@ -1376,7 +1376,7 @@
                 <w:color w:val="2D3748"/>
                 <w:sz w:val="19"/>
               </w:rPr>
-              <w:t>Real-Time Patient &amp; Therapist Dashboard</w:t>
+              <w:t>Analytics Dashboard UI</w:t>
             </w:r>
           </w:p>
         </w:tc>
@@ -1401,7 +1401,7 @@
                 <w:color w:val="2D3748"/>
                 <w:sz w:val="19"/>
               </w:rPr>
-              <w:t>st.set_page_config(), st.line_chart(), st.metric(), @st.cache_data</w:t>
+              <w:t>st.metric(), st.plotly_chart(), @st.cache_data</w:t>
             </w:r>
           </w:p>
         </w:tc>
@@ -1426,7 +1426,7 @@
                 <w:color w:val="2D3748"/>
                 <w:sz w:val="19"/>
               </w:rPr>
-              <w:t>Declarative UI rendering framework allowing instant dynamic visualization of fluency scores without frontend JS build steps.</w:t>
+              <w:t>Renders interactive web interfaces directly in Python, removing the need for a separate Node.js/React frontend.</w:t>
             </w:r>
           </w:p>
         </w:tc>
@@ -1478,7 +1478,7 @@
                 <w:color w:val="2D3748"/>
                 <w:sz w:val="19"/>
               </w:rPr>
-              <w:t>ACID-Compliant Relational Database</w:t>
+              <w:t>Local Relational Database</w:t>
             </w:r>
           </w:p>
         </w:tc>
@@ -1503,7 +1503,7 @@
                 <w:color w:val="2D3748"/>
                 <w:sz w:val="19"/>
               </w:rPr>
-              <w:t>sqlite3.connect(), Cursor.execute(), Transaction isolation</w:t>
+              <w:t>sqlite3.connect(), cursor.execute()</w:t>
             </w:r>
           </w:p>
         </w:tc>
@@ -1528,7 +1528,7 @@
                 <w:color w:val="2D3748"/>
                 <w:sz w:val="19"/>
               </w:rPr>
-              <w:t>Built-in zero-configuration SQL engine ensuring persistent local storage of speech sessions and disfluency predictions.</w:t>
+              <w:t>Built-in relational SQL engine that saves speech sessions locally in a single file without running a background server process.</w:t>
             </w:r>
           </w:p>
         </w:tc>
@@ -1580,7 +1580,7 @@
                 <w:color w:val="2D3748"/>
                 <w:sz w:val="19"/>
               </w:rPr>
-              <w:t>Digital Audio Signal Processing</w:t>
+              <w:t>Audio Signal Processing</w:t>
             </w:r>
           </w:p>
         </w:tc>
@@ -1605,7 +1605,7 @@
                 <w:color w:val="2D3748"/>
                 <w:sz w:val="19"/>
               </w:rPr>
-              <w:t>librosa.load(), librosa.feature.mfcc(), librosa.stft()</w:t>
+              <w:t>librosa.load(), librosa.feature.mfcc()</w:t>
             </w:r>
           </w:p>
         </w:tc>
@@ -1630,7 +1630,7 @@
                 <w:color w:val="2D3748"/>
                 <w:sz w:val="19"/>
               </w:rPr>
-              <w:t>Gold standard Python library for Short-Time Fourier Transforms (STFT), Mel-spectrogram generation, and MFCC feature extraction.</w:t>
+              <w:t>Calculates Short-Time Fourier Transforms, Mel-frequency spectrograms, and 13 MFCC feature coefficients from raw audio.</w:t>
             </w:r>
           </w:p>
         </w:tc>
@@ -1682,7 +1682,7 @@
                 <w:color w:val="2D3748"/>
                 <w:sz w:val="19"/>
               </w:rPr>
-              <w:t>Multidimensional Numerical Computing</w:t>
+              <w:t>Vector &amp; Matrix Math</w:t>
             </w:r>
           </w:p>
         </w:tc>
@@ -1707,7 +1707,7 @@
                 <w:color w:val="2D3748"/>
                 <w:sz w:val="19"/>
               </w:rPr>
-              <w:t>np.ndarray, np.mean(), np.std(), np.dot()</w:t>
+              <w:t>np.ndarray, np.mean(), np.std()</w:t>
             </w:r>
           </w:p>
         </w:tc>
@@ -1732,7 +1732,7 @@
                 <w:color w:val="2D3748"/>
                 <w:sz w:val="19"/>
               </w:rPr>
-              <w:t>High-performance C-optimized array manipulation used for audio frame vectorization, feature scaling, and distance metrics.</w:t>
+              <w:t>Handles array operations, feature scaling, and distance metrics in C-optimized memory blocks.</w:t>
             </w:r>
           </w:p>
         </w:tc>
@@ -1784,7 +1784,7 @@
                 <w:color w:val="2D3748"/>
                 <w:sz w:val="19"/>
               </w:rPr>
-              <w:t>Temporal Data Aggregation</w:t>
+              <w:t>Tabular Data Processing</w:t>
             </w:r>
           </w:p>
         </w:tc>
@@ -1809,7 +1809,7 @@
                 <w:color w:val="2D3748"/>
                 <w:sz w:val="19"/>
               </w:rPr>
-              <w:t>pd.DataFrame, pd.to_datetime(), df.groupby(), df.resample()</w:t>
+              <w:t>pd.DataFrame, pd.to_datetime(), df.groupby()</w:t>
             </w:r>
           </w:p>
         </w:tc>
@@ -1834,7 +1834,7 @@
                 <w:color w:val="2D3748"/>
                 <w:sz w:val="19"/>
               </w:rPr>
-              <w:t>Tabular data structure management for rolling weekly/monthly trend analysis and clinical report export generation.</w:t>
+              <w:t>Groups daily and weekly session records to compute rolling averages and export clinical CSV reports.</w:t>
             </w:r>
           </w:p>
         </w:tc>
@@ -1886,7 +1886,7 @@
                 <w:color w:val="2D3748"/>
                 <w:sz w:val="19"/>
               </w:rPr>
-              <w:t>Static Visualizations &amp; Custom Plots</w:t>
+              <w:t>Technical Figures</w:t>
             </w:r>
           </w:p>
         </w:tc>
@@ -1911,7 +1911,7 @@
                 <w:color w:val="2D3748"/>
                 <w:sz w:val="19"/>
               </w:rPr>
-              <w:t>plt.subplots(), Figure, Axes, Patches</w:t>
+              <w:t>plt.subplots(), Figure, Axes</w:t>
             </w:r>
           </w:p>
         </w:tc>
@@ -1936,7 +1936,7 @@
                 <w:color w:val="2D3748"/>
                 <w:sz w:val="19"/>
               </w:rPr>
-              <w:t>Generates high-resolution publication-grade technical figures, embedded diagrams, and clinical summary charts.</w:t>
+              <w:t>Generates high-resolution PNG architecture diagrams, flowcharts, and ER diagrams for project documentation.</w:t>
             </w:r>
           </w:p>
         </w:tc>
@@ -1988,7 +1988,7 @@
                 <w:color w:val="2D3748"/>
                 <w:sz w:val="19"/>
               </w:rPr>
-              <w:t>Interactive Chart Engine</w:t>
+              <w:t>Interactive Web Charts</w:t>
             </w:r>
           </w:p>
         </w:tc>
@@ -2013,7 +2013,7 @@
                 <w:color w:val="2D3748"/>
                 <w:sz w:val="19"/>
               </w:rPr>
-              <w:t>plotly.graph_objects.Figure, px.timeline()</w:t>
+              <w:t>go.Figure(), px.bar(), px.pie()</w:t>
             </w:r>
           </w:p>
         </w:tc>
@@ -2038,7 +2038,7 @@
                 <w:color w:val="2D3748"/>
                 <w:sz w:val="19"/>
               </w:rPr>
-              <w:t>Provides hoverable, zoomable time-series charts for speech disfluency distribution across patient recording sessions.</w:t>
+              <w:t>Renders interactive hoverable line graphs, disfluency pie charts, and fluency gauges on the Streamlit dashboard.</w:t>
             </w:r>
           </w:p>
         </w:tc>
@@ -2090,7 +2090,7 @@
                 <w:color w:val="2D3748"/>
                 <w:sz w:val="19"/>
               </w:rPr>
-              <w:t>Data Normalization &amp; Speaker Embeddings</w:t>
+              <w:t>Feature Normalization</w:t>
             </w:r>
           </w:p>
         </w:tc>
@@ -2140,7 +2140,7 @@
                 <w:color w:val="2D3748"/>
                 <w:sz w:val="19"/>
               </w:rPr>
-              <w:t>Used for standardizing feature vectors prior to neural network inference and calculating speaker verification similarity scores.</w:t>
+              <w:t>Scales MFCC feature vectors before model inference and computes cosine similarity for speaker verification.</w:t>
             </w:r>
           </w:p>
         </w:tc>
@@ -2192,7 +2192,7 @@
                 <w:color w:val="2D3748"/>
                 <w:sz w:val="19"/>
               </w:rPr>
-              <w:t>CNN-LSTM Deep Learning Inference Engine</w:t>
+              <w:t>Neural Network Inference</w:t>
             </w:r>
           </w:p>
         </w:tc>
@@ -2242,7 +2242,7 @@
                 <w:color w:val="2D3748"/>
                 <w:sz w:val="19"/>
               </w:rPr>
-              <w:t>Executes deep learning inference on extracted MFCC feature sequences to classify speech frames into Fluent vs. Disfluent categories.</w:t>
+              <w:t>Executes the trained CNN-LSTM model to classify speech frames as Fluent, Block, Repetition, or Prolongation.</w:t>
             </w:r>
           </w:p>
         </w:tc>
@@ -2294,7 +2294,7 @@
                 <w:color w:val="2D3748"/>
                 <w:sz w:val="19"/>
               </w:rPr>
-              <w:t>HTTP Client Fallback / External Sync</w:t>
+              <w:t>HTTP Client Tests</w:t>
             </w:r>
           </w:p>
         </w:tc>
@@ -2319,7 +2319,7 @@
                 <w:color w:val="2D3748"/>
                 <w:sz w:val="19"/>
               </w:rPr>
-              <w:t>requests.post(), requests.get(), Session()</w:t>
+              <w:t>requests.post(), requests.get()</w:t>
             </w:r>
           </w:p>
         </w:tc>
@@ -2344,7 +2344,7 @@
                 <w:color w:val="2D3748"/>
                 <w:sz w:val="19"/>
               </w:rPr>
-              <w:t>Handles outbound REST calls during cloud synchronization and external notification dispatching.</w:t>
+              <w:t>Sends simulated audio uploads from test scripts to the Flask server to verify API endpoints.</w:t>
             </w:r>
           </w:p>
         </w:tc>
@@ -2396,7 +2396,7 @@
                 <w:color w:val="2D3748"/>
                 <w:sz w:val="19"/>
               </w:rPr>
-              <w:t>Filesystem I/O &amp; Path Operations</w:t>
+              <w:t>File Path Operations</w:t>
             </w:r>
           </w:p>
         </w:tc>
@@ -2421,7 +2421,7 @@
                 <w:color w:val="2D3748"/>
                 <w:sz w:val="19"/>
               </w:rPr>
-              <w:t>os.path.join(), os.makedirs(), os.remove()</w:t>
+              <w:t>os.path.join(), os.makedirs()</w:t>
             </w:r>
           </w:p>
         </w:tc>
@@ -2446,7 +2446,7 @@
                 <w:color w:val="2D3748"/>
                 <w:sz w:val="19"/>
               </w:rPr>
-              <w:t>Manages temporary audio file buffers, safe directory resolution, and local file storage lifecycle.</w:t>
+              <w:t>Creates local buffer folders and manages temporary WAV file paths during audio uploads.</w:t>
             </w:r>
           </w:p>
         </w:tc>
@@ -2498,7 +2498,7 @@
                 <w:color w:val="2D3748"/>
                 <w:sz w:val="19"/>
               </w:rPr>
-              <w:t>Timestamp Serialization &amp; Time Delta</w:t>
+              <w:t>Timestamp Formatting</w:t>
             </w:r>
           </w:p>
         </w:tc>
@@ -2548,7 +2548,7 @@
                 <w:color w:val="2D3748"/>
                 <w:sz w:val="19"/>
               </w:rPr>
-              <w:t>Generates standardized ISO-8601 timestamps for session tracking, database indexing, and clinical timeline filtering.</w:t>
+              <w:t>Generates ISO-8601 timestamp strings for database indexing and session filtering.</w:t>
             </w:r>
           </w:p>
         </w:tc>
@@ -2600,7 +2600,7 @@
                 <w:color w:val="2D3748"/>
                 <w:sz w:val="19"/>
               </w:rPr>
-              <w:t>Payload Serialization / Deserialization</w:t>
+              <w:t>Data Serialization</w:t>
             </w:r>
           </w:p>
         </w:tc>
@@ -2625,7 +2625,7 @@
                 <w:color w:val="2D3748"/>
                 <w:sz w:val="19"/>
               </w:rPr>
-              <w:t>json.dumps(), json.loads(), json.JSONDecodeError</w:t>
+              <w:t>json.dumps(), json.loads()</w:t>
             </w:r>
           </w:p>
         </w:tc>
@@ -2650,7 +2650,7 @@
                 <w:color w:val="2D3748"/>
                 <w:sz w:val="19"/>
               </w:rPr>
-              <w:t>Converts complex python dictionaries into standardized JSON strings for ESP32 hardware response payloads and REST APIs.</w:t>
+              <w:t>Encodes prediction results and display messages into JSON payloads sent back to the ESP32.</w:t>
             </w:r>
           </w:p>
         </w:tc>
@@ -2673,7 +2673,7 @@
           <w:color w:val="1A365D"/>
           <w:sz w:val="36"/>
         </w:rPr>
-        <w:t>2. Flask Backend &amp; Hardware Communication Architecture</w:t>
+        <w:t>2. Flask Backend &amp; Hardware Communication</w:t>
       </w:r>
     </w:p>
     <w:p>
@@ -2688,12 +2688,12 @@
           <w:color w:val="2B6CB0"/>
           <w:sz w:val="28"/>
         </w:rPr>
-        <w:t>2.1 WSGI Microframework Selection &amp; Architectural Rationale</w:t>
+        <w:t>2.1 Why Flask Was Selected Over Alternatives</w:t>
       </w:r>
     </w:p>
     <w:p>
       <w:r>
-        <w:t>Flask is selected as the primary backend server due to its minimal WSGI overhead, explicit request routing, and straightforward handling of binary stream uploads. Unlike Django, which imposes heavy ORM abstractions and unused template engines, or FastAPI, which relies heavily on asynchronous event loops that offer no latency benefit for single-device binary stream writes, Flask provides direct, synchronous execution matching the serial processing lifecycle of audio ingestion.</w:t>
+        <w:t>We picked Flask over Django and FastAPI for our REST server. Django carries heavy ORM setups and templating engines we didn't need. FastAPI uses async event loops (`asyncio`), but our audio pipeline runs synchronous file writes and CPU matrix calculations anyway. Flask kept things simple and let us process POST uploads directly without async overhead.</w:t>
       </w:r>
     </w:p>
     <w:p>
@@ -2708,12 +2708,12 @@
           <w:color w:val="2B6CB0"/>
           <w:sz w:val="28"/>
         </w:rPr>
-        <w:t>2.2 ESP32 Audio Upload Protocol &amp; HTTP Request Flow</w:t>
+        <w:t>2.2 ESP32 Audio Upload Protocol &amp; HTTP Flow</w:t>
       </w:r>
     </w:p>
     <w:p>
       <w:r>
-        <w:t>Communication between the ESP32 microcontroller and the Flask backend takes place over a local Wi-Fi network using standard HTTP/1.1 POST requests. The ESP32 captures 16-bit PCM audio from the INMP441 I2S microphone, encapsulates it into a WAV file header, and transmits it via `multipart/form-data` or raw binary payload stream to the `/api/v1/audio/upload` REST endpoint.</w:t>
+        <w:t>The ESP32 streams recorded speech to Flask over local Wi-Fi. Once the INMP441 microphone finishes capturing audio, the board packages 16-bit 16kHz PCM samples into a WAV wrapper and sends an HTTP POST request to `http://&lt;laptop_ip&gt;:5000/api/v1/audio/upload` using `multipart/form-data`.</w:t>
       </w:r>
     </w:p>
     <w:tbl>
@@ -2760,12 +2760,12 @@
               <w:br/>
               <w:t>------VoxFlowBoundary7MA4YWxk</w:t>
               <w:br/>
-              <w:t>Content-Disposition: form-data; name="audio"; filename="rec_20260805_101500.wav"</w:t>
+              <w:t>Content-Disposition: form-data; name="audio"; filename="speech_sample.wav"</w:t>
               <w:br/>
               <w:t>Content-Type: audio/wav</w:t>
               <w:br/>
               <w:br/>
-              <w:t>[BINARY WAV DATA: 16kHz, 16-bit Mono PCM, 4 seconds]</w:t>
+              <w:t>[RAW WAV AUDIO BYTES: 16kHz, 16-bit Mono PCM, 3 Seconds]</w:t>
               <w:br/>
               <w:t>------VoxFlowBoundary7MA4YWxk--</w:t>
             </w:r>
@@ -2790,12 +2790,12 @@
           <w:color w:val="2B6CB0"/>
           <w:sz w:val="28"/>
         </w:rPr>
-        <w:t>2.3 Endpoint Route Specifications &amp; HTTP Response Handler</w:t>
+        <w:t>2.3 Endpoint Implementation &amp; Response Handler</w:t>
       </w:r>
     </w:p>
     <w:p>
       <w:r>
-        <w:t>The Flask backend exposes structured REST endpoints to handle audio ingestion, health diagnostics, prediction retrieval, and historical queries. Below is a Flask implementation snippet showing audio stream reception, temporary file staging, audio validation, pipeline execution trigger, and JSON response encoding back to the ESP32.</w:t>
+        <w:t>Our Flask server (`server.py`) runs on port 5000. When an audio file arrives, it stages the file in `./audio_buffer/`, calls our pipeline functions, writes the prediction to SQLite, and sends back JSON output containing the fluency score and OLED message text.</w:t>
       </w:r>
     </w:p>
     <w:tbl>
@@ -2835,8 +2835,14 @@
               <w:br/>
               <w:t>from datetime import datetime</w:t>
               <w:br/>
+              <w:t>from database import DatabaseManager</w:t>
+              <w:br/>
+              <w:t>from pipeline import pipeline_runner</w:t>
+              <w:br/>
               <w:br/>
               <w:t>app = Flask(__name__)</w:t>
+              <w:br/>
+              <w:t>db = DatabaseManager()</w:t>
               <w:br/>
               <w:t>UPLOAD_DIR = './audio_buffer'</w:t>
               <w:br/>
@@ -2855,13 +2861,11 @@
               <w:br/>
               <w:t xml:space="preserve">    file = request.files['audio']</w:t>
               <w:br/>
-              <w:t xml:space="preserve">    if file.filename == '' or not file.filename.endswith('.wav'):</w:t>
+              <w:t xml:space="preserve">    if file.filename == '':</w:t>
               <w:br/>
-              <w:t xml:space="preserve">        return jsonify({'status': 'error', 'message': 'Invalid file format. WAV expected'}), 415</w:t>
+              <w:t xml:space="preserve">        return jsonify({'status': 'error', 'message': 'Empty file name'}), 400</w:t>
               <w:br/>
               <w:t xml:space="preserve">    </w:t>
-              <w:br/>
-              <w:t xml:space="preserve">    # Stage audio file to temporary disk buffer</w:t>
               <w:br/>
               <w:t xml:space="preserve">    filename = f"audio_{int(time.time())}_{uuid.uuid4().hex[:6]}.wav"</w:t>
               <w:br/>
@@ -2871,27 +2875,45 @@
               <w:br/>
               <w:t xml:space="preserve">    </w:t>
               <w:br/>
-              <w:t xml:space="preserve">    # Trigger Pipeline Execution (Denoise -&gt; Verify -&gt; Extract -&gt; Predict -&gt; DB)</w:t>
+              <w:t xml:space="preserve">    # Run processing pipeline (Denoise -&gt; Verify -&gt; Extract -&gt; Predict)</w:t>
               <w:br/>
-              <w:t xml:space="preserve">    result = pipeline_runner.execute(filepath, user_id=request.form.get('user_id', 1))</w:t>
+              <w:t xml:space="preserve">    user_id = int(request.form.get('user_id', 1))</w:t>
+              <w:br/>
+              <w:t xml:space="preserve">    result = pipeline_runner.process(filepath, user_id=user_id)</w:t>
               <w:br/>
               <w:t xml:space="preserve">    </w:t>
               <w:br/>
-              <w:t xml:space="preserve">    # Response Payload for ESP32 Feedback (LEDs &amp; OLED Display)</w:t>
+              <w:t xml:space="preserve">    # Write result to SQLite database</w:t>
+              <w:br/>
+              <w:t xml:space="preserve">    pred_id = db.save_prediction(</w:t>
+              <w:br/>
+              <w:t xml:space="preserve">        user_id=user_id,</w:t>
+              <w:br/>
+              <w:t xml:space="preserve">        fluency_score=result['fluency_score'],</w:t>
+              <w:br/>
+              <w:t xml:space="preserve">        stutter_type=result['stutter_type'],</w:t>
+              <w:br/>
+              <w:t xml:space="preserve">        confidence=result['confidence'],</w:t>
+              <w:br/>
+              <w:t xml:space="preserve">        audio_path=filepath</w:t>
+              <w:br/>
+              <w:t xml:space="preserve">    )</w:t>
+              <w:br/>
+              <w:t xml:space="preserve">    </w:t>
               <w:br/>
               <w:t xml:space="preserve">    response_data = {</w:t>
               <w:br/>
               <w:t xml:space="preserve">        'status': 'success',</w:t>
               <w:br/>
+              <w:t xml:space="preserve">        'prediction_id': pred_id,</w:t>
+              <w:br/>
               <w:t xml:space="preserve">        'timestamp': datetime.now().isoformat(),</w:t>
               <w:br/>
               <w:t xml:space="preserve">        'fluency_score': result['fluency_score'],</w:t>
               <w:br/>
-              <w:t xml:space="preserve">        'stutter_detected': result['is_disfluent'],</w:t>
-              <w:br/>
               <w:t xml:space="preserve">        'stutter_type': result['stutter_type'],</w:t>
               <w:br/>
-              <w:t xml:space="preserve">        'display_message': f"Score: {result['fluency_score']:.1f}%"</w:t>
+              <w:t xml:space="preserve">        'display_message': f"Fluency: {result['fluency_score']:.1f}% ({result['stutter_type']})"</w:t>
               <w:br/>
               <w:t xml:space="preserve">    }</w:t>
               <w:br/>
@@ -2900,7 +2922,7 @@
               <w:br/>
               <w:t>if __name__ == '__main__':</w:t>
               <w:br/>
-              <w:t xml:space="preserve">    app.run(host='0.0.0.0', port=5000, debug=False, threaded=True)</w:t>
+              <w:t xml:space="preserve">    app.run(host='0.0.0.0', port=5000, debug=False)</w:t>
             </w:r>
           </w:p>
         </w:tc>
@@ -2942,7 +2964,7 @@
                 <w:color w:val="1A365D"/>
                 <w:sz w:val="19"/>
               </w:rPr>
-              <w:t>[HARDWARE-SOFTWARE FEEDBACK LOOP]</w:t>
+              <w:t>[HARDWARE FEEDBACK RESPONSE]</w:t>
               <w:br/>
             </w:r>
             <w:r>
@@ -2951,7 +2973,7 @@
                 <w:color w:val="2D3748"/>
                 <w:sz w:val="20"/>
               </w:rPr>
-              <w:t>Upon receiving HTTP 200 OK, the ESP32 parses the JSON payload. If `stutter_detected` is True, it illuminates the amber/red LED indicator and updates the OLED display with `display_message`. If False, a green LED illuminates, providing immediate visual feedback to the user.</w:t>
+              <w:t>When the ESP32 gets back HTTP 200, it reads display_message and updates the OLED screen. If stutter_type is not Fluent, it triggers the red/amber LED. Otherwise, the green LED lights up.</w:t>
             </w:r>
           </w:p>
         </w:tc>
@@ -2974,7 +2996,7 @@
           <w:color w:val="1A365D"/>
           <w:sz w:val="36"/>
         </w:rPr>
-        <w:t>3. Database Architecture &amp; Storage Flow</w:t>
+        <w:t>3. Database Design &amp; Storage Pipeline</w:t>
       </w:r>
     </w:p>
     <w:p>
@@ -2989,12 +3011,12 @@
           <w:color w:val="2B6CB0"/>
           <w:sz w:val="28"/>
         </w:rPr>
-        <w:t>3.1 SQLite Architectural Rationale &amp; Normalization</w:t>
+        <w:t>3.1 SQLite Schema &amp; 3NF Normalization</w:t>
       </w:r>
     </w:p>
     <w:p>
       <w:r>
-        <w:t>VoxFlow utilizes SQLite3 as its embedded relational database engine. SQLite requires zero server installation, provides full ACID transactional compliance, and stores all tables in a single cross-platform file (`voxflow_local.db`). The relational schema is fully normalized to Third Normal Form (3NF) to eliminate duplicate patient metadata and ensure referential integrity.</w:t>
+        <w:t>Instead of setting up a heavy MySQL instance, we went with SQLite3 (`voxflow_local.db`). It stores everything in one file on the laptop. We normalized our schema into Third Normal Form (3NF) across USERS, SESSIONS, PREDICTIONS, and REPORTS.</w:t>
       </w:r>
     </w:p>
     <w:p>
@@ -3014,7 +3036,7 @@
     </w:p>
     <w:p>
       <w:r>
-        <w:t>The SQLite database contains four primary entities: USERS, SESSIONS, PREDICTIONS, and REPORTS. The ER diagram below illustrates entity attributes, primary keys (PK), foreign keys (FK), and cardinality relationships.</w:t>
+        <w:t>Here is how our database tables, primary keys, foreign keys, and cardinalities connect:</w:t>
       </w:r>
     </w:p>
     <w:p>
@@ -3068,7 +3090,7 @@
           <w:color w:val="4A5568"/>
           <w:sz w:val="19"/>
         </w:rPr>
-        <w:t>Figure: Relational Entity-Relationship (ER) Schema for VoxFlow SQLite Storage</w:t>
+        <w:t>Figure: Relational Entity-Relationship (ER) Schema for VoxFlow</w:t>
       </w:r>
     </w:p>
     <w:p>
@@ -3083,12 +3105,12 @@
           <w:color w:val="2B6CB0"/>
           <w:sz w:val="28"/>
         </w:rPr>
-        <w:t>3.3 Data Storage Flow &amp; CRUD Operations</w:t>
+        <w:t>3.3 Database Operations &amp; CRUD Implementation</w:t>
       </w:r>
     </w:p>
     <w:p>
       <w:r>
-        <w:t>The host software accesses the database using an encapsulated Data Access Object (DAO) pattern (`DatabaseManager`). Thread-safe connection pooling is implemented by opening short-lived database connections per API request cycle.</w:t>
+        <w:t>We wrapped all SQL calls inside a `DatabaseManager` class in `database.py`. Opening connections per request and closing them right after commits avoided thread lockup problems.</w:t>
       </w:r>
     </w:p>
     <w:tbl>
@@ -3126,7 +3148,7 @@
                 <w:color w:val="FFFFFF"/>
                 <w:sz w:val="19"/>
               </w:rPr>
-              <w:t>CRUD Operation</w:t>
+              <w:t>Operation</w:t>
             </w:r>
           </w:p>
         </w:tc>
@@ -3152,7 +3174,7 @@
                 <w:color w:val="FFFFFF"/>
                 <w:sz w:val="19"/>
               </w:rPr>
-              <w:t>SQL Pattern</w:t>
+              <w:t>SQL Query Pattern</w:t>
             </w:r>
           </w:p>
         </w:tc>
@@ -3178,7 +3200,7 @@
                 <w:color w:val="FFFFFF"/>
                 <w:sz w:val="19"/>
               </w:rPr>
-              <w:t>Pipeline Trigger Event</w:t>
+              <w:t>Pipeline Trigger</w:t>
             </w:r>
           </w:p>
         </w:tc>
@@ -3204,7 +3226,7 @@
                 <w:color w:val="FFFFFF"/>
                 <w:sz w:val="19"/>
               </w:rPr>
-              <w:t>Data Returned / Stored</w:t>
+              <w:t>Result</w:t>
             </w:r>
           </w:p>
         </w:tc>
@@ -3281,7 +3303,7 @@
                 <w:color w:val="2D3748"/>
                 <w:sz w:val="19"/>
               </w:rPr>
-              <w:t>Immediate completion of CNN-LSTM inference pass.</w:t>
+              <w:t>After AI prediction finishes.</w:t>
             </w:r>
           </w:p>
         </w:tc>
@@ -3306,7 +3328,7 @@
                 <w:color w:val="2D3748"/>
                 <w:sz w:val="19"/>
               </w:rPr>
-              <w:t>Stores newly calculated disfluency metrics with auto-incrementing `pred_id`.</w:t>
+              <w:t>Inserts a new prediction record with auto-incremented `pred_id`.</w:t>
             </w:r>
           </w:p>
         </w:tc>
@@ -3383,7 +3405,7 @@
                 <w:color w:val="2D3748"/>
                 <w:sz w:val="19"/>
               </w:rPr>
-              <w:t>Streamlit dashboard load or patient history query.</w:t>
+              <w:t>When Streamlit dashboard reloads.</w:t>
             </w:r>
           </w:p>
         </w:tc>
@@ -3408,7 +3430,7 @@
                 <w:color w:val="2D3748"/>
                 <w:sz w:val="19"/>
               </w:rPr>
-              <w:t>Fetches chronological disfluency records for visual plotting and metric computation.</w:t>
+              <w:t>Fetches historical fluency records to plot daily and weekly graphs.</w:t>
             </w:r>
           </w:p>
         </w:tc>
@@ -3485,7 +3507,7 @@
                 <w:color w:val="2D3748"/>
                 <w:sz w:val="19"/>
               </w:rPr>
-              <w:t>ESP32 stream completion callback.</w:t>
+              <w:t>When an audio upload completes.</w:t>
             </w:r>
           </w:p>
         </w:tc>
@@ -3510,7 +3532,7 @@
                 <w:color w:val="2D3748"/>
                 <w:sz w:val="19"/>
               </w:rPr>
-              <w:t>Updates cumulative session duration and active status.</w:t>
+              <w:t>Updates total recorded audio duration for the active session.</w:t>
             </w:r>
           </w:p>
         </w:tc>
@@ -3587,7 +3609,7 @@
                 <w:color w:val="2D3748"/>
                 <w:sz w:val="19"/>
               </w:rPr>
-              <w:t>Therapist session archive / purge action.</w:t>
+              <w:t>When a user deletes a session.</w:t>
             </w:r>
           </w:p>
         </w:tc>
@@ -3612,7 +3634,7 @@
                 <w:color w:val="2D3748"/>
                 <w:sz w:val="19"/>
               </w:rPr>
-              <w:t>Removes obsolete recording sessions while preserving patient baseline metadata.</w:t>
+              <w:t>Removes past session records while keeping user profile data intact.</w:t>
             </w:r>
           </w:p>
         </w:tc>
@@ -3635,27 +3657,27 @@
           <w:color w:val="2B6CB0"/>
           <w:sz w:val="28"/>
         </w:rPr>
-        <w:t>3.4 Future Cloud Migration Strategy (Firebase &amp; MongoDB Atlas)</w:t>
+        <w:t>3.4 Future Cloud Migration Strategy</w:t>
       </w:r>
     </w:p>
     <w:p>
       <w:r>
-        <w:t>To support multi-device access, remote therapist oversight, and automatic offsite backups, VoxFlow features an abstracted storage layer enabling seamless future migration to NoSQL cloud databases:</w:t>
+        <w:t>SQLite handles single-laptop testing easily. To let speech therapists check patient data remotely later on, we structured our database functions so they can push to cloud storage:</w:t>
       </w:r>
     </w:p>
     <w:p>
       <w:r>
-        <w:t>• Firebase Firestore: Document-oriented cloud database featuring real-time websocket listeners. Enables instant live synchronization between the host laptop and a remote mobile application used by speech therapists.</w:t>
+        <w:t>• Firebase Firestore: Real-time document store. Pushes live session updates to a therapist's phone app as soon as audio gets classified.</w:t>
       </w:r>
     </w:p>
     <w:p>
       <w:r>
-        <w:t>• MongoDB Atlas: Scalable JSON document database suitable for storing large unstructured audio metadata, feature embeddings, and multi-tenant patient records.</w:t>
+        <w:t>• MongoDB Atlas: Handles JSON documents for storing feature arrays, raw audio paths, and patient logs across multiple users.</w:t>
       </w:r>
     </w:p>
     <w:p>
       <w:r>
-        <w:t>• Hybrid Synchronization Engine: A background worker thread periodically queries local SQLite records flagged as `synced=0`, pushes JSON payloads to cloud APIs, and sets `synced=1` upon receiving HTTP 201 Created.</w:t>
+        <w:t>• Sync Daemon: A background thread (`CloudSyncWorker`) looks for rows with `synced_flag = 0` and uploads them to cloud REST routes whenever Wi-Fi is active.</w:t>
       </w:r>
     </w:p>
     <w:p>
@@ -3670,7 +3692,7 @@
           <w:color w:val="1A365D"/>
           <w:sz w:val="36"/>
         </w:rPr>
-        <w:t>4. Streamlit Dashboard Design &amp; Functional Mechanics</w:t>
+        <w:t>4. Streamlit Dashboard Design &amp; Visual Features</w:t>
       </w:r>
     </w:p>
     <w:p>
@@ -3685,12 +3707,12 @@
           <w:color w:val="2B6CB0"/>
           <w:sz w:val="28"/>
         </w:rPr>
-        <w:t>4.1 User Interface Architecture &amp; Reactivity Model</w:t>
+        <w:t>4.1 Dashboard Framework &amp; Caching Strategy</w:t>
       </w:r>
     </w:p>
     <w:p>
       <w:r>
-        <w:t>Streamlit was selected for the VoxFlow monitoring dashboard because of its Python-native declarative UI model. Whenever a new speech prediction is inserted into the SQLite database, Streamlit reruns the script context, updating charts and metric tiles in real time. Computationally expensive operations—such as querying historical session DataFrames—are optimized using `@st.cache_data` with time-to-live (TTL) invalidation.</w:t>
+        <w:t>We built our frontend (`dashboard.py`) using Streamlit so we could stay in Python. Streamlit reruns the script whenever SQLite gets updated, so graphs refresh automatically. Using `@st.cache_data` on SQL queries prevented unnecessary database reads when changing UI filters.</w:t>
       </w:r>
     </w:p>
     <w:p>
@@ -3705,12 +3727,12 @@
           <w:color w:val="2B6CB0"/>
           <w:sz w:val="28"/>
         </w:rPr>
-        <w:t>4.2 Comprehensive Widget Justification &amp; Functional Breakdown</w:t>
+        <w:t>4.2 Dashboard Widgets &amp; Clinical Purpose</w:t>
       </w:r>
     </w:p>
     <w:p>
       <w:r>
-        <w:t>Every UI element on the dashboard serves a specific clinical or technical monitoring purpose:</w:t>
+        <w:t>Here is what each control on the dashboard does:</w:t>
       </w:r>
     </w:p>
     <w:tbl>
@@ -3774,7 +3796,7 @@
                 <w:color w:val="FFFFFF"/>
                 <w:sz w:val="19"/>
               </w:rPr>
-              <w:t>Streamlit API Primitive</w:t>
+              <w:t>Streamlit Primitive</w:t>
             </w:r>
           </w:p>
         </w:tc>
@@ -3800,7 +3822,7 @@
                 <w:color w:val="FFFFFF"/>
                 <w:sz w:val="19"/>
               </w:rPr>
-              <w:t>Clinical / Technical Purpose</w:t>
+              <w:t>Purpose</w:t>
             </w:r>
           </w:p>
         </w:tc>
@@ -3826,7 +3848,7 @@
                 <w:color w:val="FFFFFF"/>
                 <w:sz w:val="19"/>
               </w:rPr>
-              <w:t>User Interaction Behavior</w:t>
+              <w:t>User Action</w:t>
             </w:r>
           </w:p>
         </w:tc>
@@ -3903,7 +3925,7 @@
                 <w:color w:val="2D3748"/>
                 <w:sz w:val="19"/>
               </w:rPr>
-              <w:t>Select active patient profile for multi-tenant monitoring.</w:t>
+              <w:t>Switches between patient profiles.</w:t>
             </w:r>
           </w:p>
         </w:tc>
@@ -3928,7 +3950,7 @@
                 <w:color w:val="2D3748"/>
                 <w:sz w:val="19"/>
               </w:rPr>
-              <w:t>Filters database queries to display user-specific disfluency records.</w:t>
+              <w:t>Filters SQLite queries to show data for the selected user.</w:t>
             </w:r>
           </w:p>
         </w:tc>
@@ -3955,7 +3977,7 @@
                 <w:color w:val="2D3748"/>
                 <w:sz w:val="19"/>
               </w:rPr>
-              <w:t>Date Range Filter</w:t>
+              <w:t>Date Filter</w:t>
             </w:r>
           </w:p>
         </w:tc>
@@ -4005,7 +4027,7 @@
                 <w:color w:val="2D3748"/>
                 <w:sz w:val="19"/>
               </w:rPr>
-              <w:t>Select temporal range (Daily, Weekly, Monthly).</w:t>
+              <w:t>Selects date range (Daily, Weekly, Monthly).</w:t>
             </w:r>
           </w:p>
         </w:tc>
@@ -4030,7 +4052,7 @@
                 <w:color w:val="2D3748"/>
                 <w:sz w:val="19"/>
               </w:rPr>
-              <w:t>Dynamically resamples time-series charts to display progress trends.</w:t>
+              <w:t>Resamples dataset to plot trendlines for the chosen timeframe.</w:t>
             </w:r>
           </w:p>
         </w:tc>
@@ -4057,7 +4079,7 @@
                 <w:color w:val="2D3748"/>
                 <w:sz w:val="19"/>
               </w:rPr>
-              <w:t>Fluency Gauge Tile</w:t>
+              <w:t>Fluency Score Metric</w:t>
             </w:r>
           </w:p>
         </w:tc>
@@ -4107,7 +4129,7 @@
                 <w:color w:val="2D3748"/>
                 <w:sz w:val="19"/>
               </w:rPr>
-              <w:t>Displays latest speech fluency percentage (0-100%).</w:t>
+              <w:t>Displays latest speech fluency score (%).</w:t>
             </w:r>
           </w:p>
         </w:tc>
@@ -4132,7 +4154,7 @@
                 <w:color w:val="2D3748"/>
                 <w:sz w:val="19"/>
               </w:rPr>
-              <w:t>Updates live after every ESP32 upload; highlights improvement in green.</w:t>
+              <w:t>Shows current fluency level in green (&gt;78%) or red/amber (&lt;78%).</w:t>
             </w:r>
           </w:p>
         </w:tc>
@@ -4184,7 +4206,7 @@
                 <w:color w:val="2D3748"/>
                 <w:sz w:val="19"/>
               </w:rPr>
-              <w:t>st.bar_chart()</w:t>
+              <w:t>px.pie() / px.bar()</w:t>
             </w:r>
           </w:p>
         </w:tc>
@@ -4209,7 +4231,7 @@
                 <w:color w:val="2D3748"/>
                 <w:sz w:val="19"/>
               </w:rPr>
-              <w:t>Visualizes distribution of disfluency types (Block, Repetition, Prolongation).</w:t>
+              <w:t>Categorizes disfluency types.</w:t>
             </w:r>
           </w:p>
         </w:tc>
@@ -4234,7 +4256,7 @@
                 <w:color w:val="2D3748"/>
                 <w:sz w:val="19"/>
               </w:rPr>
-              <w:t>Allows therapists to identify specific stuttering patterns.</w:t>
+              <w:t>Shows proportion of Blocks, Repetitions, and Prolongations.</w:t>
             </w:r>
           </w:p>
         </w:tc>
@@ -4261,7 +4283,7 @@
                 <w:color w:val="2D3748"/>
                 <w:sz w:val="19"/>
               </w:rPr>
-              <w:t>Weekly Trend Line</w:t>
+              <w:t>Fluency Trendline</w:t>
             </w:r>
           </w:p>
         </w:tc>
@@ -4286,7 +4308,7 @@
                 <w:color w:val="2D3748"/>
                 <w:sz w:val="19"/>
               </w:rPr>
-              <w:t>st.line_chart()</w:t>
+              <w:t>go.Scatter()</w:t>
             </w:r>
           </w:p>
         </w:tc>
@@ -4311,7 +4333,7 @@
                 <w:color w:val="2D3748"/>
                 <w:sz w:val="19"/>
               </w:rPr>
-              <w:t>Plots rolling 7-day fluency average.</w:t>
+              <w:t>Plots daily scores and 7-day moving average.</w:t>
             </w:r>
           </w:p>
         </w:tc>
@@ -4336,7 +4358,7 @@
                 <w:color w:val="2D3748"/>
                 <w:sz w:val="19"/>
               </w:rPr>
-              <w:t>Helps track long-term speech stability across multiple home practice sessions.</w:t>
+              <w:t>Visualizes long-term speech progress over weeks and months.</w:t>
             </w:r>
           </w:p>
         </w:tc>
@@ -4363,7 +4385,7 @@
                 <w:color w:val="2D3748"/>
                 <w:sz w:val="19"/>
               </w:rPr>
-              <w:t>Prediction Timeline Table</w:t>
+              <w:t>Session History Table</w:t>
             </w:r>
           </w:p>
         </w:tc>
@@ -4413,7 +4435,7 @@
                 <w:color w:val="2D3748"/>
                 <w:sz w:val="19"/>
               </w:rPr>
-              <w:t>Detailed row-by-row session log with timestamps and confidence scores.</w:t>
+              <w:t>Lists individual recording logs.</w:t>
             </w:r>
           </w:p>
         </w:tc>
@@ -4438,7 +4460,7 @@
                 <w:color w:val="2D3748"/>
                 <w:sz w:val="19"/>
               </w:rPr>
-              <w:t>Provides searchable, sortable clinical audit trail.</w:t>
+              <w:t>Allows searching and sorting past session records by date or stutter type.</w:t>
             </w:r>
           </w:p>
         </w:tc>
@@ -4465,7 +4487,7 @@
                 <w:color w:val="2D3748"/>
                 <w:sz w:val="19"/>
               </w:rPr>
-              <w:t>Report Export Button</w:t>
+              <w:t>Report Download</w:t>
             </w:r>
           </w:p>
         </w:tc>
@@ -4515,7 +4537,7 @@
                 <w:color w:val="2D3748"/>
                 <w:sz w:val="19"/>
               </w:rPr>
-              <w:t>Generates downloadable PDF/CSV clinical summary report.</w:t>
+              <w:t>Exports session data to CSV/PDF.</w:t>
             </w:r>
           </w:p>
         </w:tc>
@@ -4540,109 +4562,7 @@
                 <w:color w:val="2D3748"/>
                 <w:sz w:val="19"/>
               </w:rPr>
-              <w:t>Triggers PDF compilation service for offline therapy review.</w:t>
-            </w:r>
-          </w:p>
-        </w:tc>
-      </w:tr>
-      <w:tr>
-        <w:tc>
-          <w:tcPr>
-            <w:tcW w:type="dxa" w:w="2340"/>
-            <w:shd w:val="clear" w:color="auto" w:fill="F7FAFC"/>
-            <w:tcMar>
-              <w:top w:w="80" w:type="dxa"/>
-              <w:bottom w:w="80" w:type="dxa"/>
-              <w:left w:w="120" w:type="dxa"/>
-              <w:right w:w="120" w:type="dxa"/>
-            </w:tcMar>
-          </w:tcPr>
-          <w:p>
-            <w:pPr>
-              <w:spacing w:after="0"/>
-              <w:jc w:val="left"/>
-            </w:pPr>
-            <w:r>
-              <w:rPr>
-                <w:color w:val="2D3748"/>
-                <w:sz w:val="19"/>
-              </w:rPr>
-              <w:t>Dark/Light Mode Toggle</w:t>
-            </w:r>
-          </w:p>
-        </w:tc>
-        <w:tc>
-          <w:tcPr>
-            <w:tcW w:type="dxa" w:w="2340"/>
-            <w:shd w:val="clear" w:color="auto" w:fill="F7FAFC"/>
-            <w:tcMar>
-              <w:top w:w="80" w:type="dxa"/>
-              <w:bottom w:w="80" w:type="dxa"/>
-              <w:left w:w="120" w:type="dxa"/>
-              <w:right w:w="120" w:type="dxa"/>
-            </w:tcMar>
-          </w:tcPr>
-          <w:p>
-            <w:pPr>
-              <w:spacing w:after="0"/>
-              <w:jc w:val="left"/>
-            </w:pPr>
-            <w:r>
-              <w:rPr>
-                <w:color w:val="2D3748"/>
-                <w:sz w:val="19"/>
-              </w:rPr>
-              <w:t>st.sidebar.radio()</w:t>
-            </w:r>
-          </w:p>
-        </w:tc>
-        <w:tc>
-          <w:tcPr>
-            <w:tcW w:type="dxa" w:w="2340"/>
-            <w:shd w:val="clear" w:color="auto" w:fill="F7FAFC"/>
-            <w:tcMar>
-              <w:top w:w="80" w:type="dxa"/>
-              <w:bottom w:w="80" w:type="dxa"/>
-              <w:left w:w="120" w:type="dxa"/>
-              <w:right w:w="120" w:type="dxa"/>
-            </w:tcMar>
-          </w:tcPr>
-          <w:p>
-            <w:pPr>
-              <w:spacing w:after="0"/>
-              <w:jc w:val="left"/>
-            </w:pPr>
-            <w:r>
-              <w:rPr>
-                <w:color w:val="2D3748"/>
-                <w:sz w:val="19"/>
-              </w:rPr>
-              <w:t>Adapts UI contrast for low-light home usage or clinical environments.</w:t>
-            </w:r>
-          </w:p>
-        </w:tc>
-        <w:tc>
-          <w:tcPr>
-            <w:tcW w:type="dxa" w:w="2340"/>
-            <w:shd w:val="clear" w:color="auto" w:fill="F7FAFC"/>
-            <w:tcMar>
-              <w:top w:w="80" w:type="dxa"/>
-              <w:bottom w:w="80" w:type="dxa"/>
-              <w:left w:w="120" w:type="dxa"/>
-              <w:right w:w="120" w:type="dxa"/>
-            </w:tcMar>
-          </w:tcPr>
-          <w:p>
-            <w:pPr>
-              <w:spacing w:after="0"/>
-              <w:jc w:val="left"/>
-            </w:pPr>
-            <w:r>
-              <w:rPr>
-                <w:color w:val="2D3748"/>
-                <w:sz w:val="19"/>
-              </w:rPr>
-              <w:t>Swaps Streamlit CSS theme variables dynamically.</w:t>
+              <w:t>Downloads session metrics for speech therapist review.</w:t>
             </w:r>
           </w:p>
         </w:tc>
@@ -4665,12 +4585,12 @@
           <w:color w:val="2B6CB0"/>
           <w:sz w:val="28"/>
         </w:rPr>
-        <w:t>4.3 Dashboard UI Wireframe Layout</w:t>
+        <w:t>4.3 Dashboard Wireframe Layout</w:t>
       </w:r>
     </w:p>
     <w:p>
       <w:r>
-        <w:t>The visual mockup below demonstrates the spatial organization of header metrics, main trend charts, recent session logs, and clinical export controls.</w:t>
+        <w:t>This diagram shows the layout of our metric tiles, fluency trendlines, disfluency charts, and session logs.</w:t>
       </w:r>
     </w:p>
     <w:p>
@@ -4724,7 +4644,7 @@
           <w:color w:val="4A5568"/>
           <w:sz w:val="19"/>
         </w:rPr>
-        <w:t>Figure: Streamlit Monitoring Dashboard UI Wireframe &amp; Component Layout</w:t>
+        <w:t>Figure: Streamlit Dashboard Wireframe Layout</w:t>
       </w:r>
     </w:p>
     <w:p>
@@ -4739,12 +4659,12 @@
           <w:color w:val="1A365D"/>
           <w:sz w:val="36"/>
         </w:rPr>
-        <w:t>5. Modular Software Component Breakdown</w:t>
+        <w:t>5. Software Processing Pipeline Modules</w:t>
       </w:r>
     </w:p>
     <w:p>
       <w:r>
-        <w:t>VoxFlow follows a modular software design pattern to isolate functional concerns, simplify unit testing, and enable concurrent development. The software architecture comprises seven core modules operating in sequence.</w:t>
+        <w:t>Our host software runs through seven steps in sequence. Each module handles one specific job.</w:t>
       </w:r>
     </w:p>
     <w:tbl>
@@ -4809,7 +4729,7 @@
                 <w:color w:val="FFFFFF"/>
                 <w:sz w:val="19"/>
               </w:rPr>
-              <w:t>Input Format</w:t>
+              <w:t>Input</w:t>
             </w:r>
           </w:p>
         </w:tc>
@@ -4835,7 +4755,7 @@
                 <w:color w:val="FFFFFF"/>
                 <w:sz w:val="19"/>
               </w:rPr>
-              <w:t>Output Format</w:t>
+              <w:t>Output</w:t>
             </w:r>
           </w:p>
         </w:tc>
@@ -4861,7 +4781,7 @@
                 <w:color w:val="FFFFFF"/>
                 <w:sz w:val="19"/>
               </w:rPr>
-              <w:t>Core Responsibilities</w:t>
+              <w:t>Responsibility</w:t>
             </w:r>
           </w:p>
         </w:tc>
@@ -4887,7 +4807,7 @@
                 <w:color w:val="FFFFFF"/>
                 <w:sz w:val="19"/>
               </w:rPr>
-              <w:t>Key Architectural Advantage</w:t>
+              <w:t>Key Benefit</w:t>
             </w:r>
           </w:p>
         </w:tc>
@@ -4939,7 +4859,7 @@
                 <w:color w:val="2D3748"/>
                 <w:sz w:val="19"/>
               </w:rPr>
-              <w:t>HTTP POST Stream (WAV)</w:t>
+              <w:t>HTTP POST Stream</w:t>
             </w:r>
           </w:p>
         </w:tc>
@@ -4964,7 +4884,7 @@
                 <w:color w:val="2D3748"/>
                 <w:sz w:val="19"/>
               </w:rPr>
-              <w:t>Staged Audio File (.wav)</w:t>
+              <w:t>Saved WAV File</w:t>
             </w:r>
           </w:p>
         </w:tc>
@@ -4989,7 +4909,7 @@
                 <w:color w:val="2D3748"/>
                 <w:sz w:val="19"/>
               </w:rPr>
-              <w:t>Ingests network audio payload, validates WAV headers, stages file to disk buffer.</w:t>
+              <w:t>Receives network WAV upload, checks headers, saves file to buffer folder.</w:t>
             </w:r>
           </w:p>
         </w:tc>
@@ -5014,7 +4934,7 @@
                 <w:color w:val="2D3748"/>
                 <w:sz w:val="19"/>
               </w:rPr>
-              <w:t>Network protocol isolation; prevents malformed network bytes from corrupting processing pipeline.</w:t>
+              <w:t>Prevents corrupt audio packets from entering the processing pipeline.</w:t>
             </w:r>
           </w:p>
         </w:tc>
@@ -5041,7 +4961,7 @@
                 <w:color w:val="2D3748"/>
                 <w:sz w:val="19"/>
               </w:rPr>
-              <w:t>2. Noise Removal</w:t>
+              <w:t>2. Noise Filter</w:t>
             </w:r>
           </w:p>
         </w:tc>
@@ -5066,7 +4986,7 @@
                 <w:color w:val="2D3748"/>
                 <w:sz w:val="19"/>
               </w:rPr>
-              <w:t>Raw WAV File Path</w:t>
+              <w:t>WAV File Path</w:t>
             </w:r>
           </w:p>
         </w:tc>
@@ -5116,7 +5036,7 @@
                 <w:color w:val="2D3748"/>
                 <w:sz w:val="19"/>
               </w:rPr>
-              <w:t>Applies spectral gating and 80Hz-4000Hz bandpass filtering to remove background acoustic noise.</w:t>
+              <w:t>Applies spectral gating and 80Hz-4000Hz bandpass filtering to remove background noise.</w:t>
             </w:r>
           </w:p>
         </w:tc>
@@ -5141,7 +5061,7 @@
                 <w:color w:val="2D3748"/>
                 <w:sz w:val="19"/>
               </w:rPr>
-              <w:t>Improves downstream SNR, ensuring robust model performance in noisy home environments.</w:t>
+              <w:t>Improves signal-to-noise ratio (SNR) for noisy home environments.</w:t>
             </w:r>
           </w:p>
         </w:tc>
@@ -5218,7 +5138,7 @@
                 <w:color w:val="2D3748"/>
                 <w:sz w:val="19"/>
               </w:rPr>
-              <w:t>Boolean (Pass / Reject)</w:t>
+              <w:t>Match Result (Boolean)</w:t>
             </w:r>
           </w:p>
         </w:tc>
@@ -5243,7 +5163,7 @@
                 <w:color w:val="2D3748"/>
                 <w:sz w:val="19"/>
               </w:rPr>
-              <w:t>Computes speaker embeddings and calculates cosine similarity against stored baseline.</w:t>
+              <w:t>Compares speaker embedding against stored baseline using cosine similarity.</w:t>
             </w:r>
           </w:p>
         </w:tc>
@@ -5268,7 +5188,7 @@
                 <w:color w:val="2D3748"/>
                 <w:sz w:val="19"/>
               </w:rPr>
-              <w:t>Ensures disfluency metrics are assigned strictly to the registered patient, discarding background voices.</w:t>
+              <w:t>Ensures speech analytics belong to the registered patient, discarding background voices.</w:t>
             </w:r>
           </w:p>
         </w:tc>
@@ -5370,7 +5290,7 @@
                 <w:color w:val="2D3748"/>
                 <w:sz w:val="19"/>
               </w:rPr>
-              <w:t>Extracts 13 MFCCs, Delta, and Delta-Delta coefficients; normalizes feature distributions.</w:t>
+              <w:t>Calculates 13 MFCCs, Delta, and Delta-Delta coefficients across 25ms windows.</w:t>
             </w:r>
           </w:p>
         </w:tc>
@@ -5395,7 +5315,7 @@
                 <w:color w:val="2D3748"/>
                 <w:sz w:val="19"/>
               </w:rPr>
-              <w:t>Transforms high-dimensional raw audio into compact, noise-robust spectral representations.</w:t>
+              <w:t>Converts raw audio samples into compact 39-dimensional spectral features.</w:t>
             </w:r>
           </w:p>
         </w:tc>
@@ -5447,7 +5367,7 @@
                 <w:color w:val="2D3748"/>
                 <w:sz w:val="19"/>
               </w:rPr>
-              <w:t>MFCC Feature Tensor</w:t>
+              <w:t>MFCC Tensor</w:t>
             </w:r>
           </w:p>
         </w:tc>
@@ -5472,7 +5392,7 @@
                 <w:color w:val="2D3748"/>
                 <w:sz w:val="19"/>
               </w:rPr>
-              <w:t>Prediction Dict (Score, Type)</w:t>
+              <w:t>Prediction Dictionary</w:t>
             </w:r>
           </w:p>
         </w:tc>
@@ -5497,7 +5417,7 @@
                 <w:color w:val="2D3748"/>
                 <w:sz w:val="19"/>
               </w:rPr>
-              <w:t>Wraps CNN-LSTM model inference execution; outputs fluency probabilities and stutter classifications.</w:t>
+              <w:t>Runs CNN-LSTM neural network inference to classify speech frames as Fluent or Stuttered.</w:t>
             </w:r>
           </w:p>
         </w:tc>
@@ -5522,7 +5442,7 @@
                 <w:color w:val="2D3748"/>
                 <w:sz w:val="19"/>
               </w:rPr>
-              <w:t>Encapsulates AI framework details behind clean Python interface functions.</w:t>
+              <w:t>Wraps deep learning model execution inside clean Python functions.</w:t>
             </w:r>
           </w:p>
         </w:tc>
@@ -5549,7 +5469,7 @@
                 <w:color w:val="2D3748"/>
                 <w:sz w:val="19"/>
               </w:rPr>
-              <w:t>6. Database Access Layer</w:t>
+              <w:t>6. Database Layer</w:t>
             </w:r>
           </w:p>
         </w:tc>
@@ -5599,7 +5519,7 @@
                 <w:color w:val="2D3748"/>
                 <w:sz w:val="19"/>
               </w:rPr>
-              <w:t>Persisted DB Row (ID)</w:t>
+              <w:t>SQLite Row ID</w:t>
             </w:r>
           </w:p>
         </w:tc>
@@ -5624,7 +5544,7 @@
                 <w:color w:val="2D3748"/>
                 <w:sz w:val="19"/>
               </w:rPr>
-              <w:t>Manages SQLite connections, executes parameterized SQL queries, ensures ACID writes.</w:t>
+              <w:t>Executes SQL INSERT queries and updates session records.</w:t>
             </w:r>
           </w:p>
         </w:tc>
@@ -5649,7 +5569,7 @@
                 <w:color w:val="2D3748"/>
                 <w:sz w:val="19"/>
               </w:rPr>
-              <w:t>Abstracts database interactions; enables seamless future cloud migration.</w:t>
+              <w:t>Ensures persistent local storage of all disfluency scores.</w:t>
             </w:r>
           </w:p>
         </w:tc>
@@ -5726,7 +5646,7 @@
                 <w:color w:val="2D3748"/>
                 <w:sz w:val="19"/>
               </w:rPr>
-              <w:t>Interactive HTML/CSS UI</w:t>
+              <w:t>Web UI Elements</w:t>
             </w:r>
           </w:p>
         </w:tc>
@@ -5751,7 +5671,7 @@
                 <w:color w:val="2D3748"/>
                 <w:sz w:val="19"/>
               </w:rPr>
-              <w:t>Queries persisted session data, computes rolling clinical metrics, renders interactive charts.</w:t>
+              <w:t>Queries session records and plots interactive fluency graphs on the web UI.</w:t>
             </w:r>
           </w:p>
         </w:tc>
@@ -5776,7 +5696,7 @@
                 <w:color w:val="2D3748"/>
                 <w:sz w:val="19"/>
               </w:rPr>
-              <w:t>Decouples presentation layer from data ingestion pipelines.</w:t>
+              <w:t>Separates user display logic from backend API handling.</w:t>
             </w:r>
           </w:p>
         </w:tc>
@@ -5799,7 +5719,7 @@
           <w:color w:val="1A365D"/>
           <w:sz w:val="36"/>
         </w:rPr>
-        <w:t>6. REST API Specification &amp; Endpoint Documentation</w:t>
+        <w:t>6. REST API Endpoints &amp; Specification</w:t>
       </w:r>
     </w:p>
     <w:p>
@@ -5814,12 +5734,12 @@
           <w:color w:val="2B6CB0"/>
           <w:sz w:val="28"/>
         </w:rPr>
-        <w:t>6.1 REST Architectural Principles</w:t>
+        <w:t>6.1 API Design Principles</w:t>
       </w:r>
     </w:p>
     <w:p>
       <w:r>
-        <w:t>The VoxFlow API is built according to RESTful principles: it is stateless, resource-oriented, uses standard HTTP methods (GET, POST), and returns structured JSON payloads with standard HTTP status codes.</w:t>
+        <w:t>Our REST API uses standard HTTP GET and POST methods, returning JSON payloads with standard status codes.</w:t>
       </w:r>
     </w:p>
     <w:tbl>
@@ -5858,7 +5778,7 @@
                 <w:color w:val="FFFFFF"/>
                 <w:sz w:val="19"/>
               </w:rPr>
-              <w:t>HTTP Method</w:t>
+              <w:t>Method</w:t>
             </w:r>
           </w:p>
         </w:tc>
@@ -5936,7 +5856,7 @@
                 <w:color w:val="FFFFFF"/>
                 <w:sz w:val="19"/>
               </w:rPr>
-              <w:t>Success Status</w:t>
+              <w:t>Status Code</w:t>
             </w:r>
           </w:p>
         </w:tc>
@@ -5962,7 +5882,7 @@
                 <w:color w:val="FFFFFF"/>
                 <w:sz w:val="19"/>
               </w:rPr>
-              <w:t>Description &amp; Purpose</w:t>
+              <w:t>Description</w:t>
             </w:r>
           </w:p>
         </w:tc>
@@ -6089,7 +6009,7 @@
                 <w:color w:val="2D3748"/>
                 <w:sz w:val="19"/>
               </w:rPr>
-              <w:t>System health check. Returns host server status, DB status, and model readiness.</w:t>
+              <w:t>Checks host server status and database connectivity.</w:t>
             </w:r>
           </w:p>
         </w:tc>
@@ -6191,7 +6111,7 @@
                 <w:color w:val="2D3748"/>
                 <w:sz w:val="19"/>
               </w:rPr>
-              <w:t>200 OK / 201 Created</w:t>
+              <w:t>200 OK</w:t>
             </w:r>
           </w:p>
         </w:tc>
@@ -6216,7 +6136,7 @@
                 <w:color w:val="2D3748"/>
                 <w:sz w:val="19"/>
               </w:rPr>
-              <w:t>Ingests WAV audio stream from ESP32, triggers pipeline, returns immediate prediction JSON.</w:t>
+              <w:t>Accepts WAV audio upload from ESP32, runs pipeline, and returns fluency prediction.</w:t>
             </w:r>
           </w:p>
         </w:tc>
@@ -6293,7 +6213,7 @@
                 <w:color w:val="2D3748"/>
                 <w:sz w:val="19"/>
               </w:rPr>
-              <w:t>Params: limit, offset, start_date</w:t>
+              <w:t>Params: user_id, start_date</w:t>
             </w:r>
           </w:p>
         </w:tc>
@@ -6343,7 +6263,7 @@
                 <w:color w:val="2D3748"/>
                 <w:sz w:val="19"/>
               </w:rPr>
-              <w:t>Retrieves historical disfluency prediction logs for a specific patient.</w:t>
+              <w:t>Returns historical prediction logs for a specific patient.</w:t>
             </w:r>
           </w:p>
         </w:tc>
@@ -6470,134 +6390,7 @@
                 <w:color w:val="2D3748"/>
                 <w:sz w:val="19"/>
               </w:rPr>
-              <w:t>Fetches the most recent session summary metrics for live OLED updates.</w:t>
-            </w:r>
-          </w:p>
-        </w:tc>
-      </w:tr>
-      <w:tr>
-        <w:tc>
-          <w:tcPr>
-            <w:tcW w:type="dxa" w:w="1872"/>
-            <w:shd w:val="clear" w:color="auto" w:fill="FFFFFF"/>
-            <w:tcMar>
-              <w:top w:w="80" w:type="dxa"/>
-              <w:bottom w:w="80" w:type="dxa"/>
-              <w:left w:w="120" w:type="dxa"/>
-              <w:right w:w="120" w:type="dxa"/>
-            </w:tcMar>
-          </w:tcPr>
-          <w:p>
-            <w:pPr>
-              <w:spacing w:after="0"/>
-              <w:jc w:val="left"/>
-            </w:pPr>
-            <w:r>
-              <w:rPr>
-                <w:color w:val="2D3748"/>
-                <w:sz w:val="19"/>
-              </w:rPr>
-              <w:t>GET</w:t>
-            </w:r>
-          </w:p>
-        </w:tc>
-        <w:tc>
-          <w:tcPr>
-            <w:tcW w:type="dxa" w:w="1872"/>
-            <w:shd w:val="clear" w:color="auto" w:fill="FFFFFF"/>
-            <w:tcMar>
-              <w:top w:w="80" w:type="dxa"/>
-              <w:bottom w:w="80" w:type="dxa"/>
-              <w:left w:w="120" w:type="dxa"/>
-              <w:right w:w="120" w:type="dxa"/>
-            </w:tcMar>
-          </w:tcPr>
-          <w:p>
-            <w:pPr>
-              <w:spacing w:after="0"/>
-              <w:jc w:val="left"/>
-            </w:pPr>
-            <w:r>
-              <w:rPr>
-                <w:color w:val="2D3748"/>
-                <w:sz w:val="19"/>
-              </w:rPr>
-              <w:t>/api/v1/reports/export</w:t>
-            </w:r>
-          </w:p>
-        </w:tc>
-        <w:tc>
-          <w:tcPr>
-            <w:tcW w:type="dxa" w:w="1872"/>
-            <w:shd w:val="clear" w:color="auto" w:fill="FFFFFF"/>
-            <w:tcMar>
-              <w:top w:w="80" w:type="dxa"/>
-              <w:bottom w:w="80" w:type="dxa"/>
-              <w:left w:w="120" w:type="dxa"/>
-              <w:right w:w="120" w:type="dxa"/>
-            </w:tcMar>
-          </w:tcPr>
-          <w:p>
-            <w:pPr>
-              <w:spacing w:after="0"/>
-              <w:jc w:val="left"/>
-            </w:pPr>
-            <w:r>
-              <w:rPr>
-                <w:color w:val="2D3748"/>
-                <w:sz w:val="19"/>
-              </w:rPr>
-              <w:t>Params: user_id, format (pdf/csv)</w:t>
-            </w:r>
-          </w:p>
-        </w:tc>
-        <w:tc>
-          <w:tcPr>
-            <w:tcW w:type="dxa" w:w="1872"/>
-            <w:shd w:val="clear" w:color="auto" w:fill="FFFFFF"/>
-            <w:tcMar>
-              <w:top w:w="80" w:type="dxa"/>
-              <w:bottom w:w="80" w:type="dxa"/>
-              <w:left w:w="120" w:type="dxa"/>
-              <w:right w:w="120" w:type="dxa"/>
-            </w:tcMar>
-          </w:tcPr>
-          <w:p>
-            <w:pPr>
-              <w:spacing w:after="0"/>
-              <w:jc w:val="left"/>
-            </w:pPr>
-            <w:r>
-              <w:rPr>
-                <w:color w:val="2D3748"/>
-                <w:sz w:val="19"/>
-              </w:rPr>
-              <w:t>200 OK</w:t>
-            </w:r>
-          </w:p>
-        </w:tc>
-        <w:tc>
-          <w:tcPr>
-            <w:tcW w:type="dxa" w:w="1872"/>
-            <w:shd w:val="clear" w:color="auto" w:fill="FFFFFF"/>
-            <w:tcMar>
-              <w:top w:w="80" w:type="dxa"/>
-              <w:bottom w:w="80" w:type="dxa"/>
-              <w:left w:w="120" w:type="dxa"/>
-              <w:right w:w="120" w:type="dxa"/>
-            </w:tcMar>
-          </w:tcPr>
-          <w:p>
-            <w:pPr>
-              <w:spacing w:after="0"/>
-              <w:jc w:val="left"/>
-            </w:pPr>
-            <w:r>
-              <w:rPr>
-                <w:color w:val="2D3748"/>
-                <w:sz w:val="19"/>
-              </w:rPr>
-              <w:t>Generates downloadable clinical summary reports for therapy sessions.</w:t>
+              <w:t>Fetches the latest prediction score for immediate ESP32 display updates.</w:t>
             </w:r>
           </w:p>
         </w:tc>
@@ -6620,12 +6413,12 @@
           <w:color w:val="2B6CB0"/>
           <w:sz w:val="28"/>
         </w:rPr>
-        <w:t>6.2 Sample Request &amp; Response JSON Payloads</w:t>
+        <w:t>6.2 Example JSON Request &amp; Response</w:t>
       </w:r>
     </w:p>
     <w:p>
       <w:r>
-        <w:t>Sample HTTP POST `/api/v1/audio/upload` Response Payload (Returned to ESP32):</w:t>
+        <w:t>JSON response returned by `/api/v1/audio/upload` to the ESP32:</w:t>
       </w:r>
     </w:p>
     <w:tbl>
@@ -6663,27 +6456,21 @@
               <w:br/>
               <w:t xml:space="preserve">  "status": "success",</w:t>
               <w:br/>
-              <w:t xml:space="preserve">  "request_id": "req_9920a4b1",</w:t>
+              <w:t xml:space="preserve">  "prediction_id": 171,</w:t>
               <w:br/>
-              <w:t xml:space="preserve">  "timestamp": "2026-08-05T10:15:30Z",</w:t>
+              <w:t xml:space="preserve">  "timestamp": "2026-08-05T21:21:40Z",</w:t>
               <w:br/>
-              <w:t xml:space="preserve">  "user_id": 102,</w:t>
+              <w:t xml:space="preserve">  "user_id": 1,</w:t>
               <w:br/>
-              <w:t xml:space="preserve">  "processing_time_ms": 342,</w:t>
+              <w:t xml:space="preserve">  "fluency_score": 94.8,</w:t>
               <w:br/>
-              <w:t xml:space="preserve">  "audio_duration_sec": 4.0,</w:t>
-              <w:br/>
-              <w:t xml:space="preserve">  "speaker_verified": true,</w:t>
-              <w:br/>
-              <w:t xml:space="preserve">  "fluency_score": 84.2,</w:t>
-              <w:br/>
-              <w:t xml:space="preserve">  "is_disfluent": false,</w:t>
+              <w:t xml:space="preserve">  "stutter_detected": false,</w:t>
               <w:br/>
               <w:t xml:space="preserve">  "stutter_type": "Fluent",</w:t>
               <w:br/>
-              <w:t xml:space="preserve">  "confidence": 0.941,</w:t>
+              <w:t xml:space="preserve">  "confidence": 0.97,</w:t>
               <w:br/>
-              <w:t xml:space="preserve">  "display_message": "Fluency: 84.2% (Good)"</w:t>
+              <w:t xml:space="preserve">  "display_message": "Fluency: 94.8% (Fluent)"</w:t>
               <w:br/>
               <w:t>}</w:t>
             </w:r>
@@ -6708,27 +6495,27 @@
           <w:color w:val="2B6CB0"/>
           <w:sz w:val="28"/>
         </w:rPr>
-        <w:t>6.3 Future JWT Authentication Workflow</w:t>
+        <w:t>6.3 Future JWT Authentication</w:t>
       </w:r>
     </w:p>
     <w:p>
       <w:r>
-        <w:t>To secure network endpoints when deployed across public Wi-Fi networks, a JSON Web Token (JWT) authentication handshake will be added:</w:t>
+        <w:t>For public Wi-Fi setups, JWT authentication will work as follows:</w:t>
       </w:r>
     </w:p>
     <w:p>
       <w:r>
-        <w:t>1. Authentication Request: ESP32 or Dashboard client sends credentials to `POST /api/v1/auth/login`.</w:t>
+        <w:t>1. Login: Send credentials to `POST /api/v1/auth/login`.</w:t>
       </w:r>
     </w:p>
     <w:p>
       <w:r>
-        <w:t>2. Token Issuance: Server validates credentials and returns a signed HS256 JWT access token valid for 24 hours.</w:t>
+        <w:t>2. Receive token: Server sends back a signed JWT token.</w:t>
       </w:r>
     </w:p>
     <w:p>
       <w:r>
-        <w:t>3. Protected Requests: Subsequent requests must include header `Authorization: Bearer &lt;JWT_TOKEN&gt;`. Flask decorator `@jwt_required()` validates signature before serving resources.</w:t>
+        <w:t>3. Call APIs: Include `Authorization: Bearer &lt;JWT_TOKEN&gt;` in request headers.</w:t>
       </w:r>
     </w:p>
     <w:p>
@@ -6743,12 +6530,12 @@
           <w:color w:val="1A365D"/>
           <w:sz w:val="36"/>
         </w:rPr>
-        <w:t>7. Future Cloud Integration &amp; Multi-Tenant Architecture</w:t>
+        <w:t>7. Future Scope: Cloud Integration &amp; Remote Access</w:t>
       </w:r>
     </w:p>
     <w:p>
       <w:r>
-        <w:t>While the current implementation operates entirely locally on the host laptop using SQLite, VoxFlow is designed for seamless cloud scaling. The proposed cloud architecture enables remote therapy monitoring, multi-device dashboard synchronization, and automated data backup.</w:t>
+        <w:t>While everything runs on the laptop right now via SQLite, VoxFlow can scale up to cloud syncing.</w:t>
       </w:r>
     </w:p>
     <w:tbl>
@@ -6782,7 +6569,7 @@
                 <w:color w:val="1A365D"/>
                 <w:sz w:val="19"/>
               </w:rPr>
-              <w:t>[CLOUD ARCHITECTURE &amp; SYNC STRATEGY]</w:t>
+              <w:t>[CLOUD SYNC ARCHITECTURE]</w:t>
               <w:br/>
             </w:r>
             <w:r>
@@ -6791,15 +6578,15 @@
                 <w:color w:val="2D3748"/>
                 <w:sz w:val="20"/>
               </w:rPr>
-              <w:t>Hybrid Cloud Synchronization Engine Architecture:</w:t>
+              <w:t>Cloud Synchronization Engine:</w:t>
               <w:br/>
-              <w:t>• Local SQLite database acts as a reliable primary buffer, ensuring zero data loss if Wi-Fi or Internet connectivity is interrupted.</w:t>
+              <w:t>• Local SQLite database acts as a primary buffer so no data gets lost during Wi-Fi drops.</w:t>
               <w:br/>
-              <w:t>• A background Python daemon (`CloudSyncWorker`) monitors local un-synced records (`synced_flag = 0`).</w:t>
+              <w:t>• A background worker (`CloudSyncWorker`) checks un-synced rows (`synced_flag = 0`).</w:t>
               <w:br/>
-              <w:t>• When an active Internet connection is detected, the worker batches records into JSON payloads and uploads them to Firebase Firestore or MongoDB Atlas via secure HTTPS REST calls.</w:t>
+              <w:t>• When Internet is available, it uploads records to Firebase Firestore or MongoDB Atlas.</w:t>
               <w:br/>
-              <w:t>• Remote speech therapists access real-time patient analytics through a cloud-hosted web portal, enabling continuous care between clinic visits.</w:t>
+              <w:t>• Speech therapists view real-time patient charts through a web app.</w:t>
             </w:r>
           </w:p>
         </w:tc>
@@ -6822,37 +6609,37 @@
           <w:color w:val="1A365D"/>
           <w:sz w:val="36"/>
         </w:rPr>
-        <w:t>8. Dashboard Visual Specification &amp; Wireframe Details</w:t>
+        <w:t>8. Dashboard UI Structure</w:t>
       </w:r>
     </w:p>
     <w:p>
       <w:r>
-        <w:t>The VoxFlow Streamlit dashboard UI is organized into structured visual zones to optimize clinical usability:</w:t>
+        <w:t>Our Streamlit dashboard UI breaks down into five sections:</w:t>
       </w:r>
     </w:p>
     <w:p>
       <w:r>
-        <w:t>1. Control Sidebar: Patient profile selection dropdown, date range pickers, disfluency sensitivity threshold sliders, and visual theme toggles.</w:t>
+        <w:t>1. Top Banner: Shows patient profile info and live status.</w:t>
       </w:r>
     </w:p>
     <w:p>
       <w:r>
-        <w:t>2. Metric Header Cards: High-contrast summary cards showing Current Session Score (%), Total Speech Duration (min), and Disfluency Count.</w:t>
+        <w:t>2. Metric Cards: Shows Fluency Score, Disfluency Count, Mean Score, and Model Confidence.</w:t>
       </w:r>
     </w:p>
     <w:p>
       <w:r>
-        <w:t>3. Primary Visualization Area: Dual-axis time-series chart rendering daily disfluency occurrences against a rolling 7-day progress trendline.</w:t>
+        <w:t>3. Main Trend Chart: Line graph plotting daily fluency scores and 7-day moving averages.</w:t>
       </w:r>
     </w:p>
     <w:p>
       <w:r>
-        <w:t>4. Disfluency Breakdown Panel: Categorical bar charts breaking down disfluency instances into Blocks, Repetitions, and Prolongations.</w:t>
+        <w:t>4. Categorical Breakdown: Donut chart showing Fluent vs. Stuttered event counts.</w:t>
       </w:r>
     </w:p>
     <w:p>
       <w:r>
-        <w:t>5. Interactive Data Table: Searchable table listing historical session logs with instant CSV/PDF export options.</w:t>
+        <w:t>5. Session History Table: Searchable table listing past recording logs with CSV download.</w:t>
       </w:r>
     </w:p>
     <w:p>
@@ -6867,12 +6654,12 @@
           <w:color w:val="1A365D"/>
           <w:sz w:val="36"/>
         </w:rPr>
-        <w:t>9. Complete Relational Database Schema &amp; DDL Queries</w:t>
+        <w:t>9. Complete Database DDL SQL Queries</w:t>
       </w:r>
     </w:p>
     <w:p>
       <w:r>
-        <w:t>Below are the complete DDL SQL queries used to initialize the SQLite database tables (`voxflow_local.db`):</w:t>
+        <w:t>These SQL statements create our SQLite tables (`voxflow_local.db`):</w:t>
       </w:r>
     </w:p>
     <w:tbl>
@@ -7014,12 +6801,12 @@
           <w:color w:val="1A365D"/>
           <w:sz w:val="36"/>
         </w:rPr>
-        <w:t>10. Software Processing Flowchart &amp; Step Breakdown</w:t>
+        <w:t>10. Software Processing Flowchart</w:t>
       </w:r>
     </w:p>
     <w:p>
       <w:r>
-        <w:t>The end-to-end execution flow of the host software—from receiving Wi-Fi audio packets to updating the live dashboard and returning feedback to the ESP32—is illustrated below.</w:t>
+        <w:t>Here is the execution path from receiving Wi-Fi audio to updating the OLED display and Streamlit dashboard:</w:t>
       </w:r>
     </w:p>
     <w:p>
@@ -7073,57 +6860,57 @@
           <w:color w:val="4A5568"/>
           <w:sz w:val="19"/>
         </w:rPr>
-        <w:t>Figure: Step-by-Step Software Processing Flowchart for VoxFlow</w:t>
+        <w:t>Figure: Software Processing Flowchart for VoxFlow</w:t>
       </w:r>
     </w:p>
     <w:p>
       <w:r>
-        <w:t>Operational Sequence Explanation:</w:t>
+        <w:t>Step-by-Step Flow:</w:t>
       </w:r>
     </w:p>
     <w:p>
       <w:r>
-        <w:t>1. HTTP POST Audio Stream Ingestion: Flask server accepts WAV stream from ESP32 over local Wi-Fi.</w:t>
+        <w:t>1. ESP32 sends WAV stream over Wi-Fi via POST.</w:t>
       </w:r>
     </w:p>
     <w:p>
       <w:r>
-        <w:t>2. Buffer Staging &amp; Format Verification: Validates header parameters (16kHz, 16-bit PCM) and writes bytes to temporary disk buffer.</w:t>
+        <w:t>2. Flask saves WAV bytes to `./audio_buffer/`.</w:t>
       </w:r>
     </w:p>
     <w:p>
       <w:r>
-        <w:t>3. Noise Filtering: Spectral gating reduces stationary ambient background noise.</w:t>
+        <w:t>3. Spectral filter cuts background noise.</w:t>
       </w:r>
     </w:p>
     <w:p>
       <w:r>
-        <w:t>4. Speaker Verification: Computes MFCC cosine similarity against stored patient baseline vector. If similarity &lt; threshold, request is rejected.</w:t>
+        <w:t>4. Speaker verifier checks MFCC similarity against baseline.</w:t>
       </w:r>
     </w:p>
     <w:p>
       <w:r>
-        <w:t>5. Feature Extraction: Extracts 13 MFCCs, Delta, and Delta-Delta coefficients across 25ms sliding frames.</w:t>
+        <w:t>5. Extractor pulls 13 MFCCs, Delta, and Delta-Delta features.</w:t>
       </w:r>
     </w:p>
     <w:p>
       <w:r>
-        <w:t>6. Deep Learning Prediction: Passes feature matrix into trained CNN-LSTM model to compute disfluency probability.</w:t>
+        <w:t>6. CNN-LSTM model predicts fluency probability.</w:t>
       </w:r>
     </w:p>
     <w:p>
       <w:r>
-        <w:t>7. Relational Persistence: Writes prediction record, fluency score, and timestamp to SQLite database.</w:t>
+        <w:t>7. Result gets stored in SQLite DB.</w:t>
       </w:r>
     </w:p>
     <w:p>
       <w:r>
-        <w:t>8. UI Refresh: Triggers Streamlit dashboard re-render via state invalidation.</w:t>
+        <w:t>8. Streamlit dashboard reloads graph views.</w:t>
       </w:r>
     </w:p>
     <w:p>
       <w:r>
-        <w:t>9. Hardware Feedback Payload: Returns JSON response containing score and status flags back to ESP32 for LED/OLED updates.</w:t>
+        <w:t>9. Flask sends JSON response to ESP32 to update OLED/LEDs.</w:t>
       </w:r>
     </w:p>
     <w:p>
@@ -7138,12 +6925,12 @@
           <w:color w:val="1A365D"/>
           <w:sz w:val="36"/>
         </w:rPr>
-        <w:t>11. Tiered Software Architecture Specification</w:t>
+        <w:t>11. Tiered Software Architecture</w:t>
       </w:r>
     </w:p>
     <w:p>
       <w:r>
-        <w:t>VoxFlow follows a 5-tier software architecture model that isolates hardware interfacing, network ingestion, signal processing, data storage, and presentation.</w:t>
+        <w:t>Our host system uses a 5-tier architecture:</w:t>
       </w:r>
     </w:p>
     <w:p>
@@ -7197,7 +6984,7 @@
           <w:color w:val="4A5568"/>
           <w:sz w:val="19"/>
         </w:rPr>
-        <w:t>Figure: 5-Tiered Software Architecture Diagram for VoxFlow</w:t>
+        <w:t>Figure: 5-Tiered Software Architecture Diagram</w:t>
       </w:r>
     </w:p>
     <w:p>
@@ -7207,27 +6994,27 @@
     </w:p>
     <w:p>
       <w:r>
-        <w:t>• Edge Hardware Layer: ESP32, INMP441 microphone, OLED display, and status LEDs.</w:t>
+        <w:t>• Edge Hardware Tier: ESP32, INMP441 microphone, OLED, LEDs.</w:t>
       </w:r>
     </w:p>
     <w:p>
       <w:r>
-        <w:t>• API Ingestion Layer: Flask REST WSGI server, request parsing, and input validation routines.</w:t>
+        <w:t>• API Ingestion Tier: Flask REST WSGI server.</w:t>
       </w:r>
     </w:p>
     <w:p>
       <w:r>
-        <w:t>• Audio &amp; AI Processing Core: Spectral noise filter, speaker verification module, MFCC extractor, and CNN-LSTM inference engine.</w:t>
+        <w:t>• Audio &amp; AI Processing Tier: Denoising filter, speaker verifier, MFCC extractor, CNN-LSTM model.</w:t>
       </w:r>
     </w:p>
     <w:p>
       <w:r>
-        <w:t>• Persistence Layer: SQLite local database, file system buffer manager, and cloud sync daemon.</w:t>
+        <w:t>• Persistence Tier: SQLite local database and file buffer.</w:t>
       </w:r>
     </w:p>
     <w:p>
       <w:r>
-        <w:t>• Presentation Layer: Declarative Streamlit dashboard, Plotly chart engine, and PDF report exporter.</w:t>
+        <w:t>• Presentation Tier: Streamlit web dashboard and CSV exporter.</w:t>
       </w:r>
     </w:p>
     <w:p>
@@ -7242,12 +7029,12 @@
           <w:color w:val="1A365D"/>
           <w:sz w:val="36"/>
         </w:rPr>
-        <w:t>12. Formal Object-Oriented UML Diagrams</w:t>
+        <w:t>12. Object-Oriented UML Diagrams</w:t>
       </w:r>
     </w:p>
     <w:p>
       <w:r>
-        <w:t>To provide a complete object-oriented software engineering specification, formal UML diagrams were constructed. Each diagram is presented below as both a high-resolution visual figure and copy-pasteable PlantUML / Mermaid source code.</w:t>
+        <w:t>Below are formal UML diagrams showing our class structures, sequence calls, activity paths, and communication flows.</w:t>
       </w:r>
     </w:p>
     <w:p>
@@ -7267,7 +7054,7 @@
     </w:p>
     <w:p>
       <w:r>
-        <w:t>Illustrates host domain classes, operational methods, attributes, and relationships.</w:t>
+        <w:t>Shows host software classes, methods, and associations.</w:t>
       </w:r>
     </w:p>
     <w:p>
@@ -7321,7 +7108,7 @@
           <w:color w:val="4A5568"/>
           <w:sz w:val="19"/>
         </w:rPr>
-        <w:t>Figure: UML Class Diagram for VoxFlow Host Software Architecture</w:t>
+        <w:t>Figure: UML Class Diagram</w:t>
       </w:r>
     </w:p>
     <w:tbl>
@@ -7439,7 +7226,7 @@
     </w:p>
     <w:p>
       <w:r>
-        <w:t>Triggers, lifelines, and message interactions across execution boundaries.</w:t>
+        <w:t>Shows message flow between ESP32, Flask server, processing modules, SQLite DB, and Streamlit UI.</w:t>
       </w:r>
     </w:p>
     <w:p>
@@ -7493,7 +7280,7 @@
           <w:color w:val="4A5568"/>
           <w:sz w:val="19"/>
         </w:rPr>
-        <w:t>Figure: UML Sequence Diagram for ESP32-Flask Ingestion &amp; Prediction Loop</w:t>
+        <w:t>Figure: UML Sequence Diagram</w:t>
       </w:r>
     </w:p>
     <w:tbl>
@@ -7587,7 +7374,7 @@
     </w:p>
     <w:p>
       <w:r>
-        <w:t>Decision paths for noise filtering, speaker verification match, and disfluency prediction.</w:t>
+        <w:t>Shows decision steps for noise filtering, speaker verification, and disfluency prediction.</w:t>
       </w:r>
     </w:p>
     <w:p>
@@ -7641,7 +7428,7 @@
           <w:color w:val="4A5568"/>
           <w:sz w:val="19"/>
         </w:rPr>
-        <w:t>Figure: UML Activity Diagram for Audio Ingestion and Decision Workflows</w:t>
+        <w:t>Figure: UML Activity Diagram</w:t>
       </w:r>
     </w:p>
     <w:p>
@@ -7661,7 +7448,7 @@
     </w:p>
     <w:p>
       <w:r>
-        <w:t>Object interaction networks and numbered message paths across software components.</w:t>
+        <w:t>Shows object relationships and numbered message calls during audio processing.</w:t>
       </w:r>
     </w:p>
     <w:p>
@@ -7715,7 +7502,7 @@
           <w:color w:val="4A5568"/>
           <w:sz w:val="19"/>
         </w:rPr>
-        <w:t>Figure: UML Communication Diagram for VoxFlow Host Subsystems</w:t>
+        <w:t>Figure: UML Communication Diagram</w:t>
       </w:r>
     </w:p>
     <w:sectPr>

</xml_diff>